<commit_message>
tweak rhino sighting report
</commit_message>
<xml_diff>
--- a/das/reports/docx_template/nrt.pamdas.org/daily_report_template.docx
+++ b/das/reports/docx_template/nrt.pamdas.org/daily_report_template.docx
@@ -1,6 +1,6 @@
 
 <file path=word/document.xml><?xml version="1.0" encoding="utf-8"?>
-<w:document xmlns:wpc="http://schemas.microsoft.com/office/word/2010/wordprocessingCanvas" xmlns:cx="http://schemas.microsoft.com/office/drawing/2014/chartex" xmlns:cx1="http://schemas.microsoft.com/office/drawing/2015/9/8/chartex" xmlns:cx2="http://schemas.microsoft.com/office/drawing/2015/10/21/chartex" xmlns:cx3="http://schemas.microsoft.com/office/drawing/2016/5/9/chartex" xmlns:cx4="http://schemas.microsoft.com/office/drawing/2016/5/10/chartex" xmlns:cx5="http://schemas.microsoft.com/office/drawing/2016/5/11/chartex" xmlns:cx6="http://schemas.microsoft.com/office/drawing/2016/5/12/chartex" xmlns:cx7="http://schemas.microsoft.com/office/drawing/2016/5/13/chartex" xmlns:cx8="http://schemas.microsoft.com/office/drawing/2016/5/14/chartex" xmlns:mc="http://schemas.openxmlformats.org/markup-compatibility/2006" xmlns:aink="http://schemas.microsoft.com/office/drawing/2016/ink" xmlns:am3d="http://schemas.microsoft.com/office/drawing/2017/model3d" xmlns:o="urn:schemas-microsoft-com:office:office" xmlns:r="http://schemas.openxmlformats.org/officeDocument/2006/relationships" xmlns:m="http://schemas.openxmlformats.org/officeDocument/2006/math" xmlns:v="urn:schemas-microsoft-com:vml" xmlns:wp14="http://schemas.microsoft.com/office/word/2010/wordprocessingDrawing" xmlns:wp="http://schemas.openxmlformats.org/drawingml/2006/wordprocessingDrawing" xmlns:w10="urn:schemas-microsoft-com:office:word" xmlns:w="http://schemas.openxmlformats.org/wordprocessingml/2006/main" xmlns:w14="http://schemas.microsoft.com/office/word/2010/wordml" xmlns:w15="http://schemas.microsoft.com/office/word/2012/wordml" xmlns:w16cex="http://schemas.microsoft.com/office/word/2018/wordml/cex" xmlns:w16cid="http://schemas.microsoft.com/office/word/2016/wordml/cid" xmlns:w16="http://schemas.microsoft.com/office/word/2018/wordml" xmlns:w16sdtdh="http://schemas.microsoft.com/office/word/2020/wordml/sdtdatahash" xmlns:w16se="http://schemas.microsoft.com/office/word/2015/wordml/symex" xmlns:wpg="http://schemas.microsoft.com/office/word/2010/wordprocessingGroup" xmlns:wpi="http://schemas.microsoft.com/office/word/2010/wordprocessingInk" xmlns:wne="http://schemas.microsoft.com/office/word/2006/wordml" xmlns:wps="http://schemas.microsoft.com/office/word/2010/wordprocessingShape" mc:Ignorable="w14 w15 w16se w16cid w16 w16cex w16sdtdh wp14">
+<w:document xmlns:wpc="http://schemas.microsoft.com/office/word/2010/wordprocessingCanvas" xmlns:cx="http://schemas.microsoft.com/office/drawing/2014/chartex" xmlns:cx1="http://schemas.microsoft.com/office/drawing/2015/9/8/chartex" xmlns:cx2="http://schemas.microsoft.com/office/drawing/2015/10/21/chartex" xmlns:cx3="http://schemas.microsoft.com/office/drawing/2016/5/9/chartex" xmlns:cx4="http://schemas.microsoft.com/office/drawing/2016/5/10/chartex" xmlns:cx5="http://schemas.microsoft.com/office/drawing/2016/5/11/chartex" xmlns:cx6="http://schemas.microsoft.com/office/drawing/2016/5/12/chartex" xmlns:cx7="http://schemas.microsoft.com/office/drawing/2016/5/13/chartex" xmlns:cx8="http://schemas.microsoft.com/office/drawing/2016/5/14/chartex" xmlns:mc="http://schemas.openxmlformats.org/markup-compatibility/2006" xmlns:aink="http://schemas.microsoft.com/office/drawing/2016/ink" xmlns:am3d="http://schemas.microsoft.com/office/drawing/2017/model3d" xmlns:o="urn:schemas-microsoft-com:office:office" xmlns:oel="http://schemas.microsoft.com/office/2019/extlst" xmlns:r="http://schemas.openxmlformats.org/officeDocument/2006/relationships" xmlns:m="http://schemas.openxmlformats.org/officeDocument/2006/math" xmlns:v="urn:schemas-microsoft-com:vml" xmlns:wp14="http://schemas.microsoft.com/office/word/2010/wordprocessingDrawing" xmlns:wp="http://schemas.openxmlformats.org/drawingml/2006/wordprocessingDrawing" xmlns:w10="urn:schemas-microsoft-com:office:word" xmlns:w="http://schemas.openxmlformats.org/wordprocessingml/2006/main" xmlns:w14="http://schemas.microsoft.com/office/word/2010/wordml" xmlns:w15="http://schemas.microsoft.com/office/word/2012/wordml" xmlns:w16cex="http://schemas.microsoft.com/office/word/2018/wordml/cex" xmlns:w16cid="http://schemas.microsoft.com/office/word/2016/wordml/cid" xmlns:w16="http://schemas.microsoft.com/office/word/2018/wordml" xmlns:w16sdtdh="http://schemas.microsoft.com/office/word/2020/wordml/sdtdatahash" xmlns:w16se="http://schemas.microsoft.com/office/word/2015/wordml/symex" xmlns:wpg="http://schemas.microsoft.com/office/word/2010/wordprocessingGroup" xmlns:wpi="http://schemas.microsoft.com/office/word/2010/wordprocessingInk" xmlns:wne="http://schemas.microsoft.com/office/word/2006/wordml" xmlns:wps="http://schemas.microsoft.com/office/word/2010/wordprocessingShape" mc:Ignorable="w14 w15 w16se w16cid w16 w16cex w16sdtdh wp14">
   <w:body>
     <w:p>
       <w:pPr>
@@ -53,6 +53,7 @@
           <w:szCs w:val="22"/>
         </w:rPr>
       </w:pPr>
+      <w:proofErr w:type="gramStart"/>
       <w:r>
         <w:rPr>
           <w:rFonts w:ascii="Cambria" w:hAnsi="Cambria"/>
@@ -70,7 +71,17 @@
           <w:sz w:val="22"/>
           <w:szCs w:val="22"/>
         </w:rPr>
-        <w:t>report_daterange_text</w:t>
+        <w:t>report</w:t>
+      </w:r>
+      <w:proofErr w:type="gramEnd"/>
+      <w:r>
+        <w:rPr>
+          <w:rFonts w:ascii="Cambria" w:hAnsi="Cambria"/>
+          <w:color w:val="000000"/>
+          <w:sz w:val="22"/>
+          <w:szCs w:val="22"/>
+        </w:rPr>
+        <w:t>_daterange_text</w:t>
       </w:r>
       <w:proofErr w:type="spellEnd"/>
       <w:r>
@@ -110,10 +121,18 @@
       </w:r>
       <w:proofErr w:type="spellEnd"/>
       <w:r>
-        <w:t xml:space="preserve"> %}</w:t>
-      </w:r>
-      <w:r>
-        <w:t xml:space="preserve">{% for </w:t>
+        <w:t xml:space="preserve"> </w:t>
+      </w:r>
+      <w:proofErr w:type="gramStart"/>
+      <w:r>
+        <w:t>%}</w:t>
+      </w:r>
+      <w:r>
+        <w:t>{</w:t>
+      </w:r>
+      <w:proofErr w:type="gramEnd"/>
+      <w:r>
+        <w:t xml:space="preserve">% for </w:t>
       </w:r>
       <w:proofErr w:type="spellStart"/>
       <w:r>
@@ -367,7 +386,7 @@
                 <w:sz w:val="22"/>
                 <w:szCs w:val="22"/>
               </w:rPr>
-              <w:t>Rhino Sightings today</w:t>
+              <w:t>Rhino Sightings</w:t>
             </w:r>
           </w:p>
         </w:tc>
@@ -408,6 +427,7 @@
               <w:t xml:space="preserve">{%tr for item in </w:t>
             </w:r>
             <w:proofErr w:type="spellStart"/>
+            <w:proofErr w:type="gramStart"/>
             <w:r>
               <w:rPr>
                 <w:rFonts w:ascii="Cambria" w:hAnsi="Cambria"/>
@@ -416,7 +436,18 @@
                 <w:sz w:val="22"/>
                 <w:szCs w:val="22"/>
               </w:rPr>
-              <w:t>ws.rhino_sightings</w:t>
+              <w:t>ws.rhino</w:t>
+            </w:r>
+            <w:proofErr w:type="gramEnd"/>
+            <w:r>
+              <w:rPr>
+                <w:rFonts w:ascii="Cambria" w:hAnsi="Cambria"/>
+                <w:b w:val="0"/>
+                <w:color w:val="000000"/>
+                <w:sz w:val="22"/>
+                <w:szCs w:val="22"/>
+              </w:rPr>
+              <w:t>_sightings</w:t>
             </w:r>
             <w:proofErr w:type="spellEnd"/>
             <w:r>
@@ -486,6 +517,7 @@
               <w:t>{{</w:t>
             </w:r>
             <w:proofErr w:type="spellStart"/>
+            <w:proofErr w:type="gramStart"/>
             <w:r>
               <w:rPr>
                 <w:rFonts w:ascii="Cambria" w:hAnsi="Cambria"/>
@@ -497,6 +529,7 @@
               <w:t>item.type</w:t>
             </w:r>
             <w:proofErr w:type="spellEnd"/>
+            <w:proofErr w:type="gramEnd"/>
             <w:r>
               <w:rPr>
                 <w:rFonts w:ascii="Cambria" w:hAnsi="Cambria"/>
@@ -539,6 +572,7 @@
               <w:t>{{</w:t>
             </w:r>
             <w:proofErr w:type="spellStart"/>
+            <w:proofErr w:type="gramStart"/>
             <w:r>
               <w:rPr>
                 <w:rFonts w:ascii="Cambria" w:hAnsi="Cambria"/>
@@ -549,6 +583,7 @@
               <w:t>item.count</w:t>
             </w:r>
             <w:proofErr w:type="spellEnd"/>
+            <w:proofErr w:type="gramEnd"/>
             <w:r>
               <w:rPr>
                 <w:rFonts w:ascii="Cambria" w:hAnsi="Cambria"/>
@@ -802,14 +837,25 @@
               <w:t>{{</w:t>
             </w:r>
             <w:proofErr w:type="spellStart"/>
-            <w:r>
-              <w:rPr>
-                <w:rFonts w:ascii="Cambria" w:hAnsi="Cambria"/>
-                <w:color w:val="000000"/>
-                <w:sz w:val="22"/>
-                <w:szCs w:val="22"/>
-              </w:rPr>
-              <w:t>ws.total_sightings</w:t>
+            <w:proofErr w:type="gramStart"/>
+            <w:r>
+              <w:rPr>
+                <w:rFonts w:ascii="Cambria" w:hAnsi="Cambria"/>
+                <w:color w:val="000000"/>
+                <w:sz w:val="22"/>
+                <w:szCs w:val="22"/>
+              </w:rPr>
+              <w:t>ws.total</w:t>
+            </w:r>
+            <w:proofErr w:type="gramEnd"/>
+            <w:r>
+              <w:rPr>
+                <w:rFonts w:ascii="Cambria" w:hAnsi="Cambria"/>
+                <w:color w:val="000000"/>
+                <w:sz w:val="22"/>
+                <w:szCs w:val="22"/>
+              </w:rPr>
+              <w:t>_sightings</w:t>
             </w:r>
             <w:proofErr w:type="spellEnd"/>
             <w:r>
@@ -894,17 +940,39 @@
           <w:sz w:val="22"/>
           <w:szCs w:val="22"/>
         </w:rPr>
-        <w:t xml:space="preserve"> %}</w:t>
-      </w:r>
-      <w:r>
-        <w:rPr>
-          <w:rFonts w:ascii="Cambria" w:hAnsi="Cambria"/>
-          <w:bCs w:val="0"/>
-          <w:color w:val="000000"/>
-          <w:sz w:val="22"/>
-          <w:szCs w:val="22"/>
-        </w:rPr>
-        <w:t>{% else %}</w:t>
+        <w:t xml:space="preserve"> </w:t>
+      </w:r>
+      <w:proofErr w:type="gramStart"/>
+      <w:r>
+        <w:rPr>
+          <w:rFonts w:ascii="Cambria" w:hAnsi="Cambria"/>
+          <w:bCs w:val="0"/>
+          <w:color w:val="000000"/>
+          <w:sz w:val="22"/>
+          <w:szCs w:val="22"/>
+        </w:rPr>
+        <w:t>%}</w:t>
+      </w:r>
+      <w:r>
+        <w:rPr>
+          <w:rFonts w:ascii="Cambria" w:hAnsi="Cambria"/>
+          <w:bCs w:val="0"/>
+          <w:color w:val="000000"/>
+          <w:sz w:val="22"/>
+          <w:szCs w:val="22"/>
+        </w:rPr>
+        <w:t>{</w:t>
+      </w:r>
+      <w:proofErr w:type="gramEnd"/>
+      <w:r>
+        <w:rPr>
+          <w:rFonts w:ascii="Cambria" w:hAnsi="Cambria"/>
+          <w:bCs w:val="0"/>
+          <w:color w:val="000000"/>
+          <w:sz w:val="22"/>
+          <w:szCs w:val="22"/>
+        </w:rPr>
+        <w:t>% else %}</w:t>
       </w:r>
     </w:p>
     <w:p>
@@ -962,18 +1030,41 @@
           <w:sz w:val="22"/>
           <w:szCs w:val="22"/>
         </w:rPr>
-        <w:t>{% endif %}</w:t>
-      </w:r>
-      <w:r>
-        <w:rPr>
-          <w:rFonts w:ascii="Cambria" w:hAnsi="Cambria"/>
-          <w:b/>
-          <w:bCs w:val="0"/>
-          <w:color w:val="000000"/>
-          <w:sz w:val="22"/>
-          <w:szCs w:val="22"/>
-        </w:rPr>
-        <w:t>Rhino Birth:</w:t>
+        <w:t xml:space="preserve">{% endif </w:t>
+      </w:r>
+      <w:proofErr w:type="gramStart"/>
+      <w:r>
+        <w:rPr>
+          <w:rFonts w:ascii="Cambria" w:hAnsi="Cambria"/>
+          <w:bCs w:val="0"/>
+          <w:color w:val="000000"/>
+          <w:sz w:val="22"/>
+          <w:szCs w:val="22"/>
+        </w:rPr>
+        <w:t>%}</w:t>
+      </w:r>
+      <w:r>
+        <w:rPr>
+          <w:rFonts w:ascii="Cambria" w:hAnsi="Cambria"/>
+          <w:b/>
+          <w:bCs w:val="0"/>
+          <w:color w:val="000000"/>
+          <w:sz w:val="22"/>
+          <w:szCs w:val="22"/>
+        </w:rPr>
+        <w:t>Rhino</w:t>
+      </w:r>
+      <w:proofErr w:type="gramEnd"/>
+      <w:r>
+        <w:rPr>
+          <w:rFonts w:ascii="Cambria" w:hAnsi="Cambria"/>
+          <w:b/>
+          <w:bCs w:val="0"/>
+          <w:color w:val="000000"/>
+          <w:sz w:val="22"/>
+          <w:szCs w:val="22"/>
+        </w:rPr>
+        <w:t xml:space="preserve"> Birth:</w:t>
       </w:r>
       <w:r>
         <w:rPr>
@@ -1232,6 +1323,7 @@
                 <w:szCs w:val="22"/>
               </w:rPr>
             </w:pPr>
+            <w:proofErr w:type="gramStart"/>
             <w:r>
               <w:rPr>
                 <w:rFonts w:ascii="Cambria" w:hAnsi="Cambria"/>
@@ -1253,7 +1345,19 @@
                 <w:sz w:val="22"/>
                 <w:szCs w:val="22"/>
               </w:rPr>
-              <w:t>item.conservancy</w:t>
+              <w:t>item</w:t>
+            </w:r>
+            <w:proofErr w:type="gramEnd"/>
+            <w:r>
+              <w:rPr>
+                <w:rFonts w:ascii="Cambria" w:hAnsi="Cambria"/>
+                <w:b w:val="0"/>
+                <w:bCs/>
+                <w:color w:val="000000"/>
+                <w:sz w:val="22"/>
+                <w:szCs w:val="22"/>
+              </w:rPr>
+              <w:t>.conservancy</w:t>
             </w:r>
             <w:proofErr w:type="spellEnd"/>
             <w:r>
@@ -1284,6 +1388,7 @@
                 <w:szCs w:val="22"/>
               </w:rPr>
             </w:pPr>
+            <w:proofErr w:type="gramStart"/>
             <w:r>
               <w:rPr>
                 <w:rFonts w:ascii="Cambria" w:hAnsi="Cambria"/>
@@ -1303,7 +1408,18 @@
                 <w:sz w:val="22"/>
                 <w:szCs w:val="22"/>
               </w:rPr>
-              <w:t>item.color</w:t>
+              <w:t>item</w:t>
+            </w:r>
+            <w:proofErr w:type="gramEnd"/>
+            <w:r>
+              <w:rPr>
+                <w:rFonts w:ascii="Cambria" w:hAnsi="Cambria"/>
+                <w:bCs w:val="0"/>
+                <w:color w:val="000000"/>
+                <w:sz w:val="22"/>
+                <w:szCs w:val="22"/>
+              </w:rPr>
+              <w:t>.color</w:t>
             </w:r>
             <w:proofErr w:type="spellEnd"/>
             <w:r>
@@ -1333,6 +1449,7 @@
                 <w:szCs w:val="22"/>
               </w:rPr>
             </w:pPr>
+            <w:proofErr w:type="gramStart"/>
             <w:r>
               <w:rPr>
                 <w:rFonts w:ascii="Cambria" w:hAnsi="Cambria"/>
@@ -1352,7 +1469,18 @@
                 <w:sz w:val="22"/>
                 <w:szCs w:val="22"/>
               </w:rPr>
-              <w:t>item.mother</w:t>
+              <w:t>item</w:t>
+            </w:r>
+            <w:proofErr w:type="gramEnd"/>
+            <w:r>
+              <w:rPr>
+                <w:rFonts w:ascii="Cambria" w:hAnsi="Cambria"/>
+                <w:bCs w:val="0"/>
+                <w:color w:val="000000"/>
+                <w:sz w:val="22"/>
+                <w:szCs w:val="22"/>
+              </w:rPr>
+              <w:t>.mother</w:t>
             </w:r>
             <w:proofErr w:type="spellEnd"/>
             <w:r>
@@ -1382,6 +1510,7 @@
                 <w:szCs w:val="22"/>
               </w:rPr>
             </w:pPr>
+            <w:proofErr w:type="gramStart"/>
             <w:r>
               <w:rPr>
                 <w:rFonts w:ascii="Cambria" w:hAnsi="Cambria"/>
@@ -1401,7 +1530,18 @@
                 <w:sz w:val="22"/>
                 <w:szCs w:val="22"/>
               </w:rPr>
-              <w:t>item.health</w:t>
+              <w:t>item</w:t>
+            </w:r>
+            <w:proofErr w:type="gramEnd"/>
+            <w:r>
+              <w:rPr>
+                <w:rFonts w:ascii="Cambria" w:hAnsi="Cambria"/>
+                <w:bCs w:val="0"/>
+                <w:color w:val="000000"/>
+                <w:sz w:val="22"/>
+                <w:szCs w:val="22"/>
+              </w:rPr>
+              <w:t>.health</w:t>
             </w:r>
             <w:proofErr w:type="spellEnd"/>
             <w:r>
@@ -1572,17 +1712,39 @@
           <w:szCs w:val="22"/>
         </w:rPr>
         <w:lastRenderedPageBreak/>
-        <w:t>No rhino births reported.</w:t>
-      </w:r>
-      <w:r>
-        <w:rPr>
-          <w:rFonts w:ascii="Cambria" w:hAnsi="Cambria"/>
-          <w:bCs w:val="0"/>
-          <w:color w:val="000000"/>
-          <w:sz w:val="22"/>
-          <w:szCs w:val="22"/>
-        </w:rPr>
-        <w:t>{% endif</w:t>
+        <w:t xml:space="preserve">No rhino births </w:t>
+      </w:r>
+      <w:proofErr w:type="gramStart"/>
+      <w:r>
+        <w:rPr>
+          <w:rFonts w:ascii="Cambria" w:hAnsi="Cambria"/>
+          <w:bCs w:val="0"/>
+          <w:color w:val="000000"/>
+          <w:sz w:val="22"/>
+          <w:szCs w:val="22"/>
+        </w:rPr>
+        <w:t>reported.</w:t>
+      </w:r>
+      <w:r>
+        <w:rPr>
+          <w:rFonts w:ascii="Cambria" w:hAnsi="Cambria"/>
+          <w:bCs w:val="0"/>
+          <w:color w:val="000000"/>
+          <w:sz w:val="22"/>
+          <w:szCs w:val="22"/>
+        </w:rPr>
+        <w:t>{</w:t>
+      </w:r>
+      <w:proofErr w:type="gramEnd"/>
+      <w:r>
+        <w:rPr>
+          <w:rFonts w:ascii="Cambria" w:hAnsi="Cambria"/>
+          <w:bCs w:val="0"/>
+          <w:color w:val="000000"/>
+          <w:sz w:val="22"/>
+          <w:szCs w:val="22"/>
+        </w:rPr>
+        <w:t>% endif</w:t>
       </w:r>
       <w:r>
         <w:rPr>
@@ -1626,7 +1788,29 @@
           <w:sz w:val="22"/>
           <w:szCs w:val="22"/>
         </w:rPr>
-        <w:t>Rhinos Missing for three days or more within Lewa.</w:t>
+        <w:t xml:space="preserve">Rhino Missing for three </w:t>
+      </w:r>
+      <w:r>
+        <w:rPr>
+          <w:rFonts w:ascii="Cambria" w:hAnsi="Cambria"/>
+          <w:b/>
+          <w:bCs w:val="0"/>
+          <w:color w:val="000000"/>
+          <w:sz w:val="22"/>
+          <w:szCs w:val="22"/>
+        </w:rPr>
+        <w:t xml:space="preserve">or more </w:t>
+      </w:r>
+      <w:r>
+        <w:rPr>
+          <w:rFonts w:ascii="Cambria" w:hAnsi="Cambria"/>
+          <w:b/>
+          <w:bCs w:val="0"/>
+          <w:color w:val="000000"/>
+          <w:sz w:val="22"/>
+          <w:szCs w:val="22"/>
+        </w:rPr>
+        <w:t>days.</w:t>
       </w:r>
     </w:p>
     <w:tbl>
@@ -1801,6 +1985,7 @@
                 <w:szCs w:val="22"/>
               </w:rPr>
             </w:pPr>
+            <w:proofErr w:type="gramStart"/>
             <w:r>
               <w:rPr>
                 <w:rFonts w:ascii="Cambria" w:hAnsi="Cambria"/>
@@ -1811,6 +1996,7 @@
               </w:rPr>
               <w:t>{{ item.name</w:t>
             </w:r>
+            <w:proofErr w:type="gramEnd"/>
             <w:r>
               <w:rPr>
                 <w:rFonts w:ascii="Cambria" w:hAnsi="Cambria"/>
@@ -1853,6 +2039,7 @@
                 <w:szCs w:val="22"/>
               </w:rPr>
             </w:pPr>
+            <w:proofErr w:type="gramStart"/>
             <w:r>
               <w:rPr>
                 <w:rFonts w:ascii="Cambria" w:hAnsi="Cambria"/>
@@ -1882,7 +2069,18 @@
                 <w:sz w:val="22"/>
                 <w:szCs w:val="22"/>
               </w:rPr>
-              <w:t>item.</w:t>
+              <w:t>item</w:t>
+            </w:r>
+            <w:proofErr w:type="gramEnd"/>
+            <w:r>
+              <w:rPr>
+                <w:rFonts w:ascii="Cambria" w:hAnsi="Cambria"/>
+                <w:bCs w:val="0"/>
+                <w:color w:val="000000"/>
+                <w:sz w:val="22"/>
+                <w:szCs w:val="22"/>
+              </w:rPr>
+              <w:t>.</w:t>
             </w:r>
             <w:r>
               <w:rPr>
@@ -2344,6 +2542,7 @@
                 <w:szCs w:val="22"/>
               </w:rPr>
             </w:pPr>
+            <w:proofErr w:type="gramStart"/>
             <w:r>
               <w:rPr>
                 <w:rFonts w:ascii="Cambria" w:hAnsi="Cambria"/>
@@ -2365,7 +2564,19 @@
                 <w:sz w:val="22"/>
                 <w:szCs w:val="22"/>
               </w:rPr>
-              <w:t>item.conservancy</w:t>
+              <w:t>item</w:t>
+            </w:r>
+            <w:proofErr w:type="gramEnd"/>
+            <w:r>
+              <w:rPr>
+                <w:rFonts w:ascii="Cambria" w:hAnsi="Cambria"/>
+                <w:b w:val="0"/>
+                <w:bCs/>
+                <w:color w:val="000000"/>
+                <w:sz w:val="22"/>
+                <w:szCs w:val="22"/>
+              </w:rPr>
+              <w:t>.conservancy</w:t>
             </w:r>
             <w:proofErr w:type="spellEnd"/>
             <w:r>
@@ -2396,6 +2607,7 @@
                 <w:szCs w:val="22"/>
               </w:rPr>
             </w:pPr>
+            <w:proofErr w:type="gramStart"/>
             <w:r>
               <w:rPr>
                 <w:rFonts w:ascii="Cambria" w:hAnsi="Cambria"/>
@@ -2415,7 +2627,18 @@
                 <w:sz w:val="22"/>
                 <w:szCs w:val="22"/>
               </w:rPr>
-              <w:t>item.color</w:t>
+              <w:t>item</w:t>
+            </w:r>
+            <w:proofErr w:type="gramEnd"/>
+            <w:r>
+              <w:rPr>
+                <w:rFonts w:ascii="Cambria" w:hAnsi="Cambria"/>
+                <w:bCs w:val="0"/>
+                <w:color w:val="000000"/>
+                <w:sz w:val="22"/>
+                <w:szCs w:val="22"/>
+              </w:rPr>
+              <w:t>.color</w:t>
             </w:r>
             <w:proofErr w:type="spellEnd"/>
             <w:r>
@@ -2445,6 +2668,7 @@
                 <w:szCs w:val="22"/>
               </w:rPr>
             </w:pPr>
+            <w:proofErr w:type="gramStart"/>
             <w:r>
               <w:rPr>
                 <w:rFonts w:ascii="Cambria" w:hAnsi="Cambria"/>
@@ -2464,7 +2688,18 @@
                 <w:sz w:val="22"/>
                 <w:szCs w:val="22"/>
               </w:rPr>
-              <w:t>item.station</w:t>
+              <w:t>item</w:t>
+            </w:r>
+            <w:proofErr w:type="gramEnd"/>
+            <w:r>
+              <w:rPr>
+                <w:rFonts w:ascii="Cambria" w:hAnsi="Cambria"/>
+                <w:bCs w:val="0"/>
+                <w:color w:val="000000"/>
+                <w:sz w:val="22"/>
+                <w:szCs w:val="22"/>
+              </w:rPr>
+              <w:t>.station</w:t>
             </w:r>
             <w:proofErr w:type="spellEnd"/>
             <w:r>
@@ -2494,6 +2729,7 @@
                 <w:szCs w:val="22"/>
               </w:rPr>
             </w:pPr>
+            <w:proofErr w:type="gramStart"/>
             <w:r>
               <w:rPr>
                 <w:rFonts w:ascii="Cambria" w:hAnsi="Cambria"/>
@@ -2513,7 +2749,18 @@
                 <w:sz w:val="22"/>
                 <w:szCs w:val="22"/>
               </w:rPr>
-              <w:t>item.rhinos</w:t>
+              <w:t>item</w:t>
+            </w:r>
+            <w:proofErr w:type="gramEnd"/>
+            <w:r>
+              <w:rPr>
+                <w:rFonts w:ascii="Cambria" w:hAnsi="Cambria"/>
+                <w:bCs w:val="0"/>
+                <w:color w:val="000000"/>
+                <w:sz w:val="22"/>
+                <w:szCs w:val="22"/>
+              </w:rPr>
+              <w:t>.rhinos</w:t>
             </w:r>
             <w:proofErr w:type="spellEnd"/>
             <w:r>
@@ -2543,6 +2790,7 @@
                 <w:szCs w:val="22"/>
               </w:rPr>
             </w:pPr>
+            <w:proofErr w:type="gramStart"/>
             <w:r>
               <w:rPr>
                 <w:rFonts w:ascii="Cambria" w:hAnsi="Cambria"/>
@@ -2562,7 +2810,18 @@
                 <w:sz w:val="22"/>
                 <w:szCs w:val="22"/>
               </w:rPr>
-              <w:t>item.behavior</w:t>
+              <w:t>item</w:t>
+            </w:r>
+            <w:proofErr w:type="gramEnd"/>
+            <w:r>
+              <w:rPr>
+                <w:rFonts w:ascii="Cambria" w:hAnsi="Cambria"/>
+                <w:bCs w:val="0"/>
+                <w:color w:val="000000"/>
+                <w:sz w:val="22"/>
+                <w:szCs w:val="22"/>
+              </w:rPr>
+              <w:t>.behavior</w:t>
             </w:r>
             <w:proofErr w:type="spellEnd"/>
             <w:r>
@@ -2592,6 +2851,7 @@
                 <w:szCs w:val="22"/>
               </w:rPr>
             </w:pPr>
+            <w:proofErr w:type="gramStart"/>
             <w:r>
               <w:rPr>
                 <w:rFonts w:ascii="Cambria" w:hAnsi="Cambria"/>
@@ -2611,7 +2871,18 @@
                 <w:sz w:val="22"/>
                 <w:szCs w:val="22"/>
               </w:rPr>
-              <w:t>item.health</w:t>
+              <w:t>item</w:t>
+            </w:r>
+            <w:proofErr w:type="gramEnd"/>
+            <w:r>
+              <w:rPr>
+                <w:rFonts w:ascii="Cambria" w:hAnsi="Cambria"/>
+                <w:bCs w:val="0"/>
+                <w:color w:val="000000"/>
+                <w:sz w:val="22"/>
+                <w:szCs w:val="22"/>
+              </w:rPr>
+              <w:t>.health</w:t>
             </w:r>
             <w:proofErr w:type="spellEnd"/>
             <w:r>
@@ -2949,18 +3220,40 @@
           <w:sz w:val="22"/>
           <w:szCs w:val="22"/>
         </w:rPr>
-        <w:t xml:space="preserve"> %}</w:t>
-      </w:r>
-      <w:r>
-        <w:rPr>
-          <w:rFonts w:ascii="Cambria" w:hAnsi="Cambria"/>
-          <w:b/>
-          <w:bCs w:val="0"/>
-          <w:color w:val="000000"/>
-          <w:sz w:val="22"/>
-          <w:szCs w:val="22"/>
-        </w:rPr>
-        <w:t>Other wildlife s</w:t>
+        <w:t xml:space="preserve"> </w:t>
+      </w:r>
+      <w:proofErr w:type="gramStart"/>
+      <w:r>
+        <w:rPr>
+          <w:rFonts w:ascii="Cambria" w:hAnsi="Cambria"/>
+          <w:color w:val="000000"/>
+          <w:sz w:val="22"/>
+          <w:szCs w:val="22"/>
+        </w:rPr>
+        <w:t>%}</w:t>
+      </w:r>
+      <w:r>
+        <w:rPr>
+          <w:rFonts w:ascii="Cambria" w:hAnsi="Cambria"/>
+          <w:b/>
+          <w:bCs w:val="0"/>
+          <w:color w:val="000000"/>
+          <w:sz w:val="22"/>
+          <w:szCs w:val="22"/>
+        </w:rPr>
+        <w:t>Other</w:t>
+      </w:r>
+      <w:proofErr w:type="gramEnd"/>
+      <w:r>
+        <w:rPr>
+          <w:rFonts w:ascii="Cambria" w:hAnsi="Cambria"/>
+          <w:b/>
+          <w:bCs w:val="0"/>
+          <w:color w:val="000000"/>
+          <w:sz w:val="22"/>
+          <w:szCs w:val="22"/>
+        </w:rPr>
+        <w:t xml:space="preserve"> wildlife s</w:t>
       </w:r>
       <w:r>
         <w:rPr>
@@ -3132,6 +3425,7 @@
               <w:t xml:space="preserve">tr for item in </w:t>
             </w:r>
             <w:proofErr w:type="spellStart"/>
+            <w:proofErr w:type="gramStart"/>
             <w:r>
               <w:rPr>
                 <w:rFonts w:ascii="Cambria" w:hAnsi="Cambria"/>
@@ -3143,6 +3437,7 @@
               <w:t>os.sightings</w:t>
             </w:r>
             <w:proofErr w:type="spellEnd"/>
+            <w:proofErr w:type="gramEnd"/>
             <w:r>
               <w:rPr>
                 <w:rFonts w:ascii="Cambria" w:hAnsi="Cambria"/>
@@ -3219,6 +3514,7 @@
                 <w:szCs w:val="22"/>
               </w:rPr>
             </w:pPr>
+            <w:proofErr w:type="gramStart"/>
             <w:r>
               <w:rPr>
                 <w:rFonts w:ascii="Cambria" w:hAnsi="Cambria"/>
@@ -3238,7 +3534,18 @@
                 <w:sz w:val="22"/>
                 <w:szCs w:val="22"/>
               </w:rPr>
-              <w:t>item.species</w:t>
+              <w:t>item</w:t>
+            </w:r>
+            <w:proofErr w:type="gramEnd"/>
+            <w:r>
+              <w:rPr>
+                <w:rFonts w:ascii="Cambria" w:hAnsi="Cambria"/>
+                <w:b w:val="0"/>
+                <w:color w:val="000000"/>
+                <w:sz w:val="22"/>
+                <w:szCs w:val="22"/>
+              </w:rPr>
+              <w:t>.species</w:t>
             </w:r>
             <w:proofErr w:type="spellEnd"/>
             <w:r>
@@ -3285,6 +3592,7 @@
               <w:t>{{</w:t>
             </w:r>
             <w:proofErr w:type="spellStart"/>
+            <w:proofErr w:type="gramStart"/>
             <w:r>
               <w:rPr>
                 <w:rFonts w:ascii="Cambria" w:hAnsi="Cambria"/>
@@ -3296,6 +3604,7 @@
               <w:t>item.count</w:t>
             </w:r>
             <w:proofErr w:type="spellEnd"/>
+            <w:proofErr w:type="gramEnd"/>
             <w:r>
               <w:rPr>
                 <w:rFonts w:ascii="Cambria" w:hAnsi="Cambria"/>
@@ -3459,15 +3768,27 @@
         <w:t>ted = {{</w:t>
       </w:r>
       <w:proofErr w:type="spellStart"/>
-      <w:r>
-        <w:rPr>
-          <w:rFonts w:ascii="Cambria" w:hAnsi="Cambria"/>
-          <w:b/>
-          <w:color w:val="000000"/>
-          <w:sz w:val="22"/>
-          <w:szCs w:val="22"/>
-        </w:rPr>
-        <w:t>os.total_sightings</w:t>
+      <w:proofErr w:type="gramStart"/>
+      <w:r>
+        <w:rPr>
+          <w:rFonts w:ascii="Cambria" w:hAnsi="Cambria"/>
+          <w:b/>
+          <w:color w:val="000000"/>
+          <w:sz w:val="22"/>
+          <w:szCs w:val="22"/>
+        </w:rPr>
+        <w:t>os.total</w:t>
+      </w:r>
+      <w:proofErr w:type="gramEnd"/>
+      <w:r>
+        <w:rPr>
+          <w:rFonts w:ascii="Cambria" w:hAnsi="Cambria"/>
+          <w:b/>
+          <w:color w:val="000000"/>
+          <w:sz w:val="22"/>
+          <w:szCs w:val="22"/>
+        </w:rPr>
+        <w:t>_sightings</w:t>
       </w:r>
       <w:proofErr w:type="spellEnd"/>
       <w:r>
@@ -3816,6 +4137,7 @@
                 <w:szCs w:val="22"/>
               </w:rPr>
             </w:pPr>
+            <w:proofErr w:type="gramStart"/>
             <w:r>
               <w:rPr>
                 <w:rFonts w:ascii="Cambria" w:hAnsi="Cambria"/>
@@ -3837,7 +4159,19 @@
                 <w:sz w:val="22"/>
                 <w:szCs w:val="22"/>
               </w:rPr>
-              <w:t>item.conservancy</w:t>
+              <w:t>item</w:t>
+            </w:r>
+            <w:proofErr w:type="gramEnd"/>
+            <w:r>
+              <w:rPr>
+                <w:rFonts w:ascii="Cambria" w:hAnsi="Cambria"/>
+                <w:b w:val="0"/>
+                <w:bCs/>
+                <w:color w:val="000000"/>
+                <w:sz w:val="22"/>
+                <w:szCs w:val="22"/>
+              </w:rPr>
+              <w:t>.conservancy</w:t>
             </w:r>
             <w:proofErr w:type="spellEnd"/>
             <w:r>
@@ -3868,6 +4202,7 @@
                 <w:szCs w:val="22"/>
               </w:rPr>
             </w:pPr>
+            <w:proofErr w:type="gramStart"/>
             <w:r>
               <w:rPr>
                 <w:rFonts w:ascii="Cambria" w:hAnsi="Cambria"/>
@@ -3887,7 +4222,18 @@
                 <w:sz w:val="22"/>
                 <w:szCs w:val="22"/>
               </w:rPr>
-              <w:t>item.species</w:t>
+              <w:t>item</w:t>
+            </w:r>
+            <w:proofErr w:type="gramEnd"/>
+            <w:r>
+              <w:rPr>
+                <w:rFonts w:ascii="Cambria" w:hAnsi="Cambria"/>
+                <w:bCs w:val="0"/>
+                <w:color w:val="000000"/>
+                <w:sz w:val="22"/>
+                <w:szCs w:val="22"/>
+              </w:rPr>
+              <w:t>.species</w:t>
             </w:r>
             <w:proofErr w:type="spellEnd"/>
             <w:r>
@@ -3917,6 +4263,7 @@
                 <w:szCs w:val="22"/>
               </w:rPr>
             </w:pPr>
+            <w:proofErr w:type="gramStart"/>
             <w:r>
               <w:rPr>
                 <w:rFonts w:ascii="Cambria" w:hAnsi="Cambria"/>
@@ -3936,7 +4283,18 @@
                 <w:sz w:val="22"/>
                 <w:szCs w:val="22"/>
               </w:rPr>
-              <w:t>item.</w:t>
+              <w:t>item</w:t>
+            </w:r>
+            <w:proofErr w:type="gramEnd"/>
+            <w:r>
+              <w:rPr>
+                <w:rFonts w:ascii="Cambria" w:hAnsi="Cambria"/>
+                <w:bCs w:val="0"/>
+                <w:color w:val="000000"/>
+                <w:sz w:val="22"/>
+                <w:szCs w:val="22"/>
+              </w:rPr>
+              <w:t>.</w:t>
             </w:r>
             <w:r>
               <w:rPr>
@@ -3976,6 +4334,7 @@
                 <w:szCs w:val="22"/>
               </w:rPr>
             </w:pPr>
+            <w:proofErr w:type="gramStart"/>
             <w:r>
               <w:rPr>
                 <w:rFonts w:ascii="Cambria" w:hAnsi="Cambria"/>
@@ -3995,7 +4354,18 @@
                 <w:sz w:val="22"/>
                 <w:szCs w:val="22"/>
               </w:rPr>
-              <w:t>item.</w:t>
+              <w:t>item</w:t>
+            </w:r>
+            <w:proofErr w:type="gramEnd"/>
+            <w:r>
+              <w:rPr>
+                <w:rFonts w:ascii="Cambria" w:hAnsi="Cambria"/>
+                <w:bCs w:val="0"/>
+                <w:color w:val="000000"/>
+                <w:sz w:val="22"/>
+                <w:szCs w:val="22"/>
+              </w:rPr>
+              <w:t>.</w:t>
             </w:r>
             <w:r>
               <w:rPr>
@@ -4035,6 +4405,7 @@
                 <w:szCs w:val="22"/>
               </w:rPr>
             </w:pPr>
+            <w:proofErr w:type="gramStart"/>
             <w:r>
               <w:rPr>
                 <w:rFonts w:ascii="Cambria" w:hAnsi="Cambria"/>
@@ -4054,7 +4425,18 @@
                 <w:sz w:val="22"/>
                 <w:szCs w:val="22"/>
               </w:rPr>
-              <w:t>item.number_animals</w:t>
+              <w:t>item</w:t>
+            </w:r>
+            <w:proofErr w:type="gramEnd"/>
+            <w:r>
+              <w:rPr>
+                <w:rFonts w:ascii="Cambria" w:hAnsi="Cambria"/>
+                <w:bCs w:val="0"/>
+                <w:color w:val="000000"/>
+                <w:sz w:val="22"/>
+                <w:szCs w:val="22"/>
+              </w:rPr>
+              <w:t>.number_animals</w:t>
             </w:r>
             <w:proofErr w:type="spellEnd"/>
             <w:r>
@@ -4342,17 +4724,39 @@
           <w:sz w:val="22"/>
           <w:szCs w:val="22"/>
         </w:rPr>
-        <w:t>Wildlife movement through the gaps:</w:t>
-      </w:r>
-      <w:r>
-        <w:rPr>
-          <w:rFonts w:ascii="Cambria" w:hAnsi="Cambria"/>
-          <w:bCs w:val="0"/>
-          <w:color w:val="000000"/>
-          <w:sz w:val="22"/>
-          <w:szCs w:val="22"/>
-        </w:rPr>
-        <w:t xml:space="preserve">{% if </w:t>
+        <w:t xml:space="preserve">Wildlife movement through the </w:t>
+      </w:r>
+      <w:proofErr w:type="gramStart"/>
+      <w:r>
+        <w:rPr>
+          <w:rFonts w:ascii="Cambria" w:hAnsi="Cambria"/>
+          <w:b/>
+          <w:color w:val="000000"/>
+          <w:sz w:val="22"/>
+          <w:szCs w:val="22"/>
+        </w:rPr>
+        <w:t>gaps:</w:t>
+      </w:r>
+      <w:r>
+        <w:rPr>
+          <w:rFonts w:ascii="Cambria" w:hAnsi="Cambria"/>
+          <w:bCs w:val="0"/>
+          <w:color w:val="000000"/>
+          <w:sz w:val="22"/>
+          <w:szCs w:val="22"/>
+        </w:rPr>
+        <w:t>{</w:t>
+      </w:r>
+      <w:proofErr w:type="gramEnd"/>
+      <w:r>
+        <w:rPr>
+          <w:rFonts w:ascii="Cambria" w:hAnsi="Cambria"/>
+          <w:bCs w:val="0"/>
+          <w:color w:val="000000"/>
+          <w:sz w:val="22"/>
+          <w:szCs w:val="22"/>
+        </w:rPr>
+        <w:t xml:space="preserve">% if </w:t>
       </w:r>
       <w:proofErr w:type="spellStart"/>
       <w:r>
@@ -4729,6 +5133,7 @@
               <w:t>{{</w:t>
             </w:r>
             <w:proofErr w:type="spellStart"/>
+            <w:proofErr w:type="gramStart"/>
             <w:r>
               <w:rPr>
                 <w:rFonts w:ascii="Cambria" w:hAnsi="Cambria"/>
@@ -4740,6 +5145,7 @@
               <w:t>item.species</w:t>
             </w:r>
             <w:proofErr w:type="spellEnd"/>
+            <w:proofErr w:type="gramEnd"/>
             <w:r>
               <w:rPr>
                 <w:rFonts w:ascii="Cambria" w:hAnsi="Cambria"/>
@@ -4784,6 +5190,7 @@
               <w:t>{{</w:t>
             </w:r>
             <w:proofErr w:type="spellStart"/>
+            <w:proofErr w:type="gramStart"/>
             <w:r>
               <w:rPr>
                 <w:rFonts w:ascii="Cambria" w:hAnsi="Cambria"/>
@@ -4792,7 +5199,18 @@
                 <w:sz w:val="22"/>
                 <w:szCs w:val="22"/>
               </w:rPr>
-              <w:t>item.total_in</w:t>
+              <w:t>item.total</w:t>
+            </w:r>
+            <w:proofErr w:type="gramEnd"/>
+            <w:r>
+              <w:rPr>
+                <w:rFonts w:ascii="Cambria" w:hAnsi="Cambria"/>
+                <w:bCs w:val="0"/>
+                <w:color w:val="000000"/>
+                <w:sz w:val="22"/>
+                <w:szCs w:val="22"/>
+              </w:rPr>
+              <w:t>_in</w:t>
             </w:r>
             <w:proofErr w:type="spellEnd"/>
             <w:r>
@@ -4839,6 +5257,7 @@
               <w:t>{{</w:t>
             </w:r>
             <w:proofErr w:type="spellStart"/>
+            <w:proofErr w:type="gramStart"/>
             <w:r>
               <w:rPr>
                 <w:rFonts w:ascii="Cambria" w:hAnsi="Cambria"/>
@@ -4847,7 +5266,18 @@
                 <w:sz w:val="22"/>
                 <w:szCs w:val="22"/>
               </w:rPr>
-              <w:t>item.total_out</w:t>
+              <w:t>item.total</w:t>
+            </w:r>
+            <w:proofErr w:type="gramEnd"/>
+            <w:r>
+              <w:rPr>
+                <w:rFonts w:ascii="Cambria" w:hAnsi="Cambria"/>
+                <w:bCs w:val="0"/>
+                <w:color w:val="000000"/>
+                <w:sz w:val="22"/>
+                <w:szCs w:val="22"/>
+              </w:rPr>
+              <w:t>_out</w:t>
             </w:r>
             <w:proofErr w:type="spellEnd"/>
             <w:r>
@@ -5200,6 +5630,7 @@
           <w:szCs w:val="22"/>
         </w:rPr>
       </w:pPr>
+      <w:proofErr w:type="gramStart"/>
       <w:r>
         <w:rPr>
           <w:rFonts w:ascii="Cambria" w:hAnsi="Cambria"/>
@@ -5223,6 +5654,7 @@
         </w:rPr>
         <w:t>hwc</w:t>
       </w:r>
+      <w:proofErr w:type="gramEnd"/>
       <w:r>
         <w:rPr>
           <w:rFonts w:ascii="Cambria" w:hAnsi="Cambria"/>
@@ -5339,6 +5771,7 @@
         <w:t xml:space="preserve"> in </w:t>
       </w:r>
       <w:proofErr w:type="spellStart"/>
+      <w:proofErr w:type="gramStart"/>
       <w:r>
         <w:rPr>
           <w:rFonts w:ascii="Cambria" w:hAnsi="Cambria"/>
@@ -5350,6 +5783,7 @@
         <w:t>hwc.attributes</w:t>
       </w:r>
       <w:proofErr w:type="spellEnd"/>
+      <w:proofErr w:type="gramEnd"/>
       <w:r>
         <w:rPr>
           <w:rFonts w:ascii="Cambria" w:hAnsi="Cambria"/>
@@ -5482,6 +5916,7 @@
         <w:t xml:space="preserve">{% for note in </w:t>
       </w:r>
       <w:proofErr w:type="spellStart"/>
+      <w:proofErr w:type="gramStart"/>
       <w:r>
         <w:rPr>
           <w:rFonts w:ascii="Cambria" w:hAnsi="Cambria"/>
@@ -5503,6 +5938,7 @@
         <w:t>.notes</w:t>
       </w:r>
       <w:proofErr w:type="spellEnd"/>
+      <w:proofErr w:type="gramEnd"/>
       <w:r>
         <w:rPr>
           <w:rFonts w:ascii="Cambria" w:hAnsi="Cambria"/>
@@ -5938,6 +6374,7 @@
         </w:rPr>
         <w:t xml:space="preserve">Rainfall for: </w:t>
       </w:r>
+      <w:proofErr w:type="gramStart"/>
       <w:r>
         <w:rPr>
           <w:rFonts w:ascii="Cambria" w:hAnsi="Cambria"/>
@@ -5970,7 +6407,19 @@
           <w:sz w:val="22"/>
           <w:szCs w:val="22"/>
         </w:rPr>
-        <w:t>conservancy.</w:t>
+        <w:t>conservancy</w:t>
+      </w:r>
+      <w:proofErr w:type="gramEnd"/>
+      <w:r>
+        <w:rPr>
+          <w:rFonts w:ascii="Cambria" w:hAnsi="Cambria"/>
+          <w:b/>
+          <w:bCs w:val="0"/>
+          <w:color w:val="000000"/>
+          <w:sz w:val="22"/>
+          <w:szCs w:val="22"/>
+        </w:rPr>
+        <w:t>.</w:t>
       </w:r>
       <w:r>
         <w:rPr>
@@ -6154,6 +6603,7 @@
               <w:t xml:space="preserve">{%tr for item in </w:t>
             </w:r>
             <w:proofErr w:type="spellStart"/>
+            <w:proofErr w:type="gramStart"/>
             <w:r>
               <w:rPr>
                 <w:rFonts w:ascii="Cambria" w:hAnsi="Cambria"/>
@@ -6165,6 +6615,7 @@
               <w:t>conservancy.rainfall</w:t>
             </w:r>
             <w:proofErr w:type="spellEnd"/>
+            <w:proofErr w:type="gramEnd"/>
             <w:r>
               <w:rPr>
                 <w:rFonts w:ascii="Cambria" w:hAnsi="Cambria"/>
@@ -6226,6 +6677,7 @@
                 <w:szCs w:val="22"/>
               </w:rPr>
             </w:pPr>
+            <w:proofErr w:type="gramStart"/>
             <w:r>
               <w:rPr>
                 <w:rFonts w:ascii="Cambria" w:hAnsi="Cambria"/>
@@ -6245,7 +6697,18 @@
                 <w:sz w:val="22"/>
                 <w:szCs w:val="22"/>
               </w:rPr>
-              <w:t>item.station</w:t>
+              <w:t>item</w:t>
+            </w:r>
+            <w:proofErr w:type="gramEnd"/>
+            <w:r>
+              <w:rPr>
+                <w:rFonts w:ascii="Cambria" w:hAnsi="Cambria"/>
+                <w:b w:val="0"/>
+                <w:color w:val="000000"/>
+                <w:sz w:val="22"/>
+                <w:szCs w:val="22"/>
+              </w:rPr>
+              <w:t>.station</w:t>
             </w:r>
             <w:proofErr w:type="spellEnd"/>
             <w:r>
@@ -6280,6 +6743,7 @@
                 <w:szCs w:val="22"/>
               </w:rPr>
             </w:pPr>
+            <w:proofErr w:type="gramStart"/>
             <w:r>
               <w:rPr>
                 <w:rFonts w:ascii="Cambria" w:hAnsi="Cambria"/>
@@ -6297,7 +6761,17 @@
                 <w:sz w:val="22"/>
                 <w:szCs w:val="22"/>
               </w:rPr>
-              <w:t>item.total_mm</w:t>
+              <w:t>item</w:t>
+            </w:r>
+            <w:proofErr w:type="gramEnd"/>
+            <w:r>
+              <w:rPr>
+                <w:rFonts w:ascii="Cambria" w:hAnsi="Cambria"/>
+                <w:color w:val="000000"/>
+                <w:sz w:val="22"/>
+                <w:szCs w:val="22"/>
+              </w:rPr>
+              <w:t>.total_mm</w:t>
             </w:r>
             <w:proofErr w:type="spellEnd"/>
             <w:r>
@@ -6451,7 +6925,29 @@
           <w:sz w:val="22"/>
           <w:szCs w:val="22"/>
         </w:rPr>
-        <w:t>No new rainfall report.</w:t>
+        <w:t xml:space="preserve">No new rainfall </w:t>
+      </w:r>
+      <w:proofErr w:type="gramStart"/>
+      <w:r>
+        <w:rPr>
+          <w:rFonts w:ascii="Cambria" w:hAnsi="Cambria"/>
+          <w:bCs w:val="0"/>
+          <w:color w:val="000000"/>
+          <w:sz w:val="22"/>
+          <w:szCs w:val="22"/>
+        </w:rPr>
+        <w:t>report</w:t>
+      </w:r>
+      <w:proofErr w:type="gramEnd"/>
+      <w:r>
+        <w:rPr>
+          <w:rFonts w:ascii="Cambria" w:hAnsi="Cambria"/>
+          <w:bCs w:val="0"/>
+          <w:color w:val="000000"/>
+          <w:sz w:val="22"/>
+          <w:szCs w:val="22"/>
+        </w:rPr>
+        <w:t>.</w:t>
       </w:r>
     </w:p>
     <w:p>
@@ -6681,6 +7177,7 @@
           <w:szCs w:val="22"/>
         </w:rPr>
       </w:pPr>
+      <w:proofErr w:type="gramStart"/>
       <w:r>
         <w:rPr>
           <w:rFonts w:ascii="Cambria" w:hAnsi="Cambria"/>
@@ -6702,7 +7199,19 @@
           <w:sz w:val="22"/>
           <w:szCs w:val="22"/>
         </w:rPr>
-        <w:t>se.event_name</w:t>
+        <w:t>se</w:t>
+      </w:r>
+      <w:proofErr w:type="gramEnd"/>
+      <w:r>
+        <w:rPr>
+          <w:rFonts w:ascii="Cambria" w:hAnsi="Cambria"/>
+          <w:b/>
+          <w:bCs w:val="0"/>
+          <w:color w:val="000000"/>
+          <w:sz w:val="22"/>
+          <w:szCs w:val="22"/>
+        </w:rPr>
+        <w:t>.event_name</w:t>
       </w:r>
       <w:proofErr w:type="spellEnd"/>
       <w:r>
@@ -6809,6 +7318,7 @@
         <w:t xml:space="preserve"> in </w:t>
       </w:r>
       <w:proofErr w:type="spellStart"/>
+      <w:proofErr w:type="gramStart"/>
       <w:r>
         <w:rPr>
           <w:rFonts w:ascii="Cambria" w:hAnsi="Cambria"/>
@@ -6820,6 +7330,7 @@
         <w:t>se.attributes</w:t>
       </w:r>
       <w:proofErr w:type="spellEnd"/>
+      <w:proofErr w:type="gramEnd"/>
       <w:r>
         <w:rPr>
           <w:rFonts w:ascii="Cambria" w:hAnsi="Cambria"/>
@@ -6952,6 +7463,7 @@
         <w:t xml:space="preserve">{% for note in </w:t>
       </w:r>
       <w:proofErr w:type="spellStart"/>
+      <w:proofErr w:type="gramStart"/>
       <w:r>
         <w:rPr>
           <w:rFonts w:ascii="Cambria" w:hAnsi="Cambria"/>
@@ -6963,6 +7475,7 @@
         <w:t>se.notes</w:t>
       </w:r>
       <w:proofErr w:type="spellEnd"/>
+      <w:proofErr w:type="gramEnd"/>
       <w:r>
         <w:rPr>
           <w:rFonts w:ascii="Cambria" w:hAnsi="Cambria"/>
@@ -7286,17 +7799,7 @@
           <w:sz w:val="22"/>
           <w:szCs w:val="22"/>
         </w:rPr>
-        <w:t>findrep</w:t>
-      </w:r>
-      <w:r>
-        <w:rPr>
-          <w:rFonts w:ascii="Cambria" w:hAnsi="Cambria"/>
-          <w:bCs w:val="0"/>
-          <w:color w:val="000000"/>
-          <w:sz w:val="22"/>
-          <w:szCs w:val="22"/>
-        </w:rPr>
-        <w:t>_events</w:t>
+        <w:t>findrep_events</w:t>
       </w:r>
       <w:proofErr w:type="spellEnd"/>
       <w:r>
@@ -7326,6 +7829,7 @@
           <w:szCs w:val="22"/>
         </w:rPr>
       </w:pPr>
+      <w:proofErr w:type="gramStart"/>
       <w:r>
         <w:rPr>
           <w:rFonts w:ascii="Cambria" w:hAnsi="Cambria"/>
@@ -7347,7 +7851,19 @@
           <w:sz w:val="22"/>
           <w:szCs w:val="22"/>
         </w:rPr>
-        <w:t>se.event_name</w:t>
+        <w:t>se</w:t>
+      </w:r>
+      <w:proofErr w:type="gramEnd"/>
+      <w:r>
+        <w:rPr>
+          <w:rFonts w:ascii="Cambria" w:hAnsi="Cambria"/>
+          <w:b/>
+          <w:bCs w:val="0"/>
+          <w:color w:val="000000"/>
+          <w:sz w:val="22"/>
+          <w:szCs w:val="22"/>
+        </w:rPr>
+        <w:t>.event_name</w:t>
       </w:r>
       <w:proofErr w:type="spellEnd"/>
       <w:r>
@@ -7444,6 +7960,7 @@
         <w:t xml:space="preserve"> in </w:t>
       </w:r>
       <w:proofErr w:type="spellStart"/>
+      <w:proofErr w:type="gramStart"/>
       <w:r>
         <w:rPr>
           <w:rFonts w:ascii="Cambria" w:hAnsi="Cambria"/>
@@ -7455,6 +7972,7 @@
         <w:t>se.attributes</w:t>
       </w:r>
       <w:proofErr w:type="spellEnd"/>
+      <w:proofErr w:type="gramEnd"/>
       <w:r>
         <w:rPr>
           <w:rFonts w:ascii="Cambria" w:hAnsi="Cambria"/>
@@ -7588,6 +8106,7 @@
         <w:t xml:space="preserve">{% for note in </w:t>
       </w:r>
       <w:proofErr w:type="spellStart"/>
+      <w:proofErr w:type="gramStart"/>
       <w:r>
         <w:rPr>
           <w:rFonts w:ascii="Cambria" w:hAnsi="Cambria"/>
@@ -7599,6 +8118,7 @@
         <w:t>se.notes</w:t>
       </w:r>
       <w:proofErr w:type="spellEnd"/>
+      <w:proofErr w:type="gramEnd"/>
       <w:r>
         <w:rPr>
           <w:rFonts w:ascii="Cambria" w:hAnsi="Cambria"/>
@@ -7890,7 +8410,18 @@
           <w:sz w:val="22"/>
           <w:szCs w:val="22"/>
         </w:rPr>
-        <w:t>Fence Break</w:t>
+        <w:t xml:space="preserve">Fence </w:t>
+      </w:r>
+      <w:proofErr w:type="gramStart"/>
+      <w:r>
+        <w:rPr>
+          <w:rFonts w:ascii="Cambria" w:hAnsi="Cambria"/>
+          <w:b/>
+          <w:color w:val="000000"/>
+          <w:sz w:val="22"/>
+          <w:szCs w:val="22"/>
+        </w:rPr>
+        <w:t>Break</w:t>
       </w:r>
       <w:r>
         <w:rPr>
@@ -7920,7 +8451,18 @@
           <w:sz w:val="22"/>
           <w:szCs w:val="22"/>
         </w:rPr>
-        <w:t xml:space="preserve">{% if </w:t>
+        <w:t>{</w:t>
+      </w:r>
+      <w:proofErr w:type="gramEnd"/>
+      <w:r>
+        <w:rPr>
+          <w:rFonts w:ascii="Cambria" w:hAnsi="Cambria"/>
+          <w:bCs w:val="0"/>
+          <w:color w:val="000000"/>
+          <w:sz w:val="22"/>
+          <w:szCs w:val="22"/>
+        </w:rPr>
+        <w:t xml:space="preserve">% if </w:t>
       </w:r>
       <w:proofErr w:type="spellStart"/>
       <w:r>
@@ -8243,6 +8785,7 @@
                 <w:szCs w:val="22"/>
               </w:rPr>
             </w:pPr>
+            <w:proofErr w:type="gramStart"/>
             <w:r>
               <w:rPr>
                 <w:rFonts w:ascii="Cambria" w:hAnsi="Cambria"/>
@@ -8262,7 +8805,18 @@
                 <w:sz w:val="22"/>
                 <w:szCs w:val="22"/>
               </w:rPr>
-              <w:t>item.time</w:t>
+              <w:t>item</w:t>
+            </w:r>
+            <w:proofErr w:type="gramEnd"/>
+            <w:r>
+              <w:rPr>
+                <w:rFonts w:ascii="Cambria" w:hAnsi="Cambria"/>
+                <w:b w:val="0"/>
+                <w:color w:val="000000"/>
+                <w:sz w:val="22"/>
+                <w:szCs w:val="22"/>
+              </w:rPr>
+              <w:t>.time</w:t>
             </w:r>
             <w:proofErr w:type="spellEnd"/>
             <w:r>
@@ -8306,6 +8860,7 @@
               <w:t>{{</w:t>
             </w:r>
             <w:proofErr w:type="spellStart"/>
+            <w:proofErr w:type="gramStart"/>
             <w:r>
               <w:rPr>
                 <w:rFonts w:ascii="Cambria" w:hAnsi="Cambria"/>
@@ -8316,6 +8871,7 @@
               <w:t>item.section</w:t>
             </w:r>
             <w:proofErr w:type="spellEnd"/>
+            <w:proofErr w:type="gramEnd"/>
             <w:r>
               <w:rPr>
                 <w:rFonts w:ascii="Cambria" w:hAnsi="Cambria"/>
@@ -8346,6 +8902,7 @@
                 <w:szCs w:val="22"/>
               </w:rPr>
             </w:pPr>
+            <w:proofErr w:type="gramStart"/>
             <w:r>
               <w:rPr>
                 <w:rFonts w:ascii="Cambria" w:hAnsi="Cambria"/>
@@ -8363,7 +8920,17 @@
                 <w:sz w:val="22"/>
                 <w:szCs w:val="22"/>
               </w:rPr>
-              <w:t>item.species</w:t>
+              <w:t>item</w:t>
+            </w:r>
+            <w:proofErr w:type="gramEnd"/>
+            <w:r>
+              <w:rPr>
+                <w:rFonts w:ascii="Cambria" w:hAnsi="Cambria"/>
+                <w:color w:val="000000"/>
+                <w:sz w:val="22"/>
+                <w:szCs w:val="22"/>
+              </w:rPr>
+              <w:t>.species</w:t>
             </w:r>
             <w:proofErr w:type="spellEnd"/>
             <w:r>
@@ -8396,6 +8963,7 @@
                 <w:szCs w:val="22"/>
               </w:rPr>
             </w:pPr>
+            <w:proofErr w:type="gramStart"/>
             <w:r>
               <w:rPr>
                 <w:rFonts w:ascii="Cambria" w:hAnsi="Cambria"/>
@@ -8413,7 +8981,17 @@
                 <w:sz w:val="22"/>
                 <w:szCs w:val="22"/>
               </w:rPr>
-              <w:t>item.animal_name</w:t>
+              <w:t>item</w:t>
+            </w:r>
+            <w:proofErr w:type="gramEnd"/>
+            <w:r>
+              <w:rPr>
+                <w:rFonts w:ascii="Cambria" w:hAnsi="Cambria"/>
+                <w:color w:val="000000"/>
+                <w:sz w:val="22"/>
+                <w:szCs w:val="22"/>
+              </w:rPr>
+              <w:t>.animal_name</w:t>
             </w:r>
             <w:proofErr w:type="spellEnd"/>
             <w:r>
@@ -8446,6 +9024,7 @@
                 <w:szCs w:val="22"/>
               </w:rPr>
             </w:pPr>
+            <w:proofErr w:type="gramStart"/>
             <w:r>
               <w:rPr>
                 <w:rFonts w:ascii="Cambria" w:hAnsi="Cambria"/>
@@ -8463,7 +9042,17 @@
                 <w:sz w:val="22"/>
                 <w:szCs w:val="22"/>
               </w:rPr>
-              <w:t>item.reported_by</w:t>
+              <w:t>item</w:t>
+            </w:r>
+            <w:proofErr w:type="gramEnd"/>
+            <w:r>
+              <w:rPr>
+                <w:rFonts w:ascii="Cambria" w:hAnsi="Cambria"/>
+                <w:color w:val="000000"/>
+                <w:sz w:val="22"/>
+                <w:szCs w:val="22"/>
+              </w:rPr>
+              <w:t>.reported_by</w:t>
             </w:r>
             <w:proofErr w:type="spellEnd"/>
             <w:r>
@@ -8496,6 +9085,7 @@
                 <w:szCs w:val="22"/>
               </w:rPr>
             </w:pPr>
+            <w:proofErr w:type="gramStart"/>
             <w:r>
               <w:rPr>
                 <w:rFonts w:ascii="Cambria" w:hAnsi="Cambria"/>
@@ -8513,7 +9103,17 @@
                 <w:sz w:val="22"/>
                 <w:szCs w:val="22"/>
               </w:rPr>
-              <w:t>item.action</w:t>
+              <w:t>item</w:t>
+            </w:r>
+            <w:proofErr w:type="gramEnd"/>
+            <w:r>
+              <w:rPr>
+                <w:rFonts w:ascii="Cambria" w:hAnsi="Cambria"/>
+                <w:color w:val="000000"/>
+                <w:sz w:val="22"/>
+                <w:szCs w:val="22"/>
+              </w:rPr>
+              <w:t>.action</w:t>
             </w:r>
             <w:proofErr w:type="spellEnd"/>
             <w:r>
@@ -8556,6 +9156,7 @@
               <w:t>{{</w:t>
             </w:r>
             <w:proofErr w:type="spellStart"/>
+            <w:proofErr w:type="gramStart"/>
             <w:r>
               <w:rPr>
                 <w:rFonts w:ascii="Cambria" w:hAnsi="Cambria"/>
@@ -8575,6 +9176,7 @@
               <w:t>back</w:t>
             </w:r>
             <w:proofErr w:type="spellEnd"/>
+            <w:proofErr w:type="gramEnd"/>
             <w:r>
               <w:rPr>
                 <w:rFonts w:ascii="Cambria" w:hAnsi="Cambria"/>
@@ -8940,6 +9542,7 @@
           <w:szCs w:val="22"/>
         </w:rPr>
       </w:pPr>
+      <w:proofErr w:type="gramStart"/>
       <w:r>
         <w:rPr>
           <w:rFonts w:ascii="Cambria" w:hAnsi="Cambria"/>
@@ -8961,7 +9564,19 @@
           <w:sz w:val="22"/>
           <w:szCs w:val="22"/>
         </w:rPr>
-        <w:t>se.event_name</w:t>
+        <w:t>se</w:t>
+      </w:r>
+      <w:proofErr w:type="gramEnd"/>
+      <w:r>
+        <w:rPr>
+          <w:rFonts w:ascii="Cambria" w:hAnsi="Cambria"/>
+          <w:b/>
+          <w:bCs w:val="0"/>
+          <w:color w:val="000000"/>
+          <w:sz w:val="22"/>
+          <w:szCs w:val="22"/>
+        </w:rPr>
+        <w:t>.event_name</w:t>
       </w:r>
       <w:proofErr w:type="spellEnd"/>
       <w:r>
@@ -9058,6 +9673,7 @@
         <w:t xml:space="preserve"> in </w:t>
       </w:r>
       <w:proofErr w:type="spellStart"/>
+      <w:proofErr w:type="gramStart"/>
       <w:r>
         <w:rPr>
           <w:rFonts w:ascii="Cambria" w:hAnsi="Cambria"/>
@@ -9069,6 +9685,7 @@
         <w:t>se.attributes</w:t>
       </w:r>
       <w:proofErr w:type="spellEnd"/>
+      <w:proofErr w:type="gramEnd"/>
       <w:r>
         <w:rPr>
           <w:rFonts w:ascii="Cambria" w:hAnsi="Cambria"/>
@@ -9201,6 +9818,7 @@
         <w:t xml:space="preserve">{% for note in </w:t>
       </w:r>
       <w:proofErr w:type="spellStart"/>
+      <w:proofErr w:type="gramStart"/>
       <w:r>
         <w:rPr>
           <w:rFonts w:ascii="Cambria" w:hAnsi="Cambria"/>
@@ -9212,6 +9830,7 @@
         <w:t>se.notes</w:t>
       </w:r>
       <w:proofErr w:type="spellEnd"/>
+      <w:proofErr w:type="gramEnd"/>
       <w:r>
         <w:rPr>
           <w:rFonts w:ascii="Cambria" w:hAnsi="Cambria"/>
@@ -9601,7 +10220,7 @@
 </file>
 
 <file path=word/endnotes.xml><?xml version="1.0" encoding="utf-8"?>
-<w:endnotes xmlns:wpc="http://schemas.microsoft.com/office/word/2010/wordprocessingCanvas" xmlns:cx="http://schemas.microsoft.com/office/drawing/2014/chartex" xmlns:cx1="http://schemas.microsoft.com/office/drawing/2015/9/8/chartex" xmlns:cx2="http://schemas.microsoft.com/office/drawing/2015/10/21/chartex" xmlns:cx3="http://schemas.microsoft.com/office/drawing/2016/5/9/chartex" xmlns:cx4="http://schemas.microsoft.com/office/drawing/2016/5/10/chartex" xmlns:cx5="http://schemas.microsoft.com/office/drawing/2016/5/11/chartex" xmlns:cx6="http://schemas.microsoft.com/office/drawing/2016/5/12/chartex" xmlns:cx7="http://schemas.microsoft.com/office/drawing/2016/5/13/chartex" xmlns:cx8="http://schemas.microsoft.com/office/drawing/2016/5/14/chartex" xmlns:mc="http://schemas.openxmlformats.org/markup-compatibility/2006" xmlns:aink="http://schemas.microsoft.com/office/drawing/2016/ink" xmlns:am3d="http://schemas.microsoft.com/office/drawing/2017/model3d" xmlns:o="urn:schemas-microsoft-com:office:office" xmlns:r="http://schemas.openxmlformats.org/officeDocument/2006/relationships" xmlns:m="http://schemas.openxmlformats.org/officeDocument/2006/math" xmlns:v="urn:schemas-microsoft-com:vml" xmlns:wp14="http://schemas.microsoft.com/office/word/2010/wordprocessingDrawing" xmlns:wp="http://schemas.openxmlformats.org/drawingml/2006/wordprocessingDrawing" xmlns:w10="urn:schemas-microsoft-com:office:word" xmlns:w="http://schemas.openxmlformats.org/wordprocessingml/2006/main" xmlns:w14="http://schemas.microsoft.com/office/word/2010/wordml" xmlns:w15="http://schemas.microsoft.com/office/word/2012/wordml" xmlns:w16cex="http://schemas.microsoft.com/office/word/2018/wordml/cex" xmlns:w16cid="http://schemas.microsoft.com/office/word/2016/wordml/cid" xmlns:w16="http://schemas.microsoft.com/office/word/2018/wordml" xmlns:w16sdtdh="http://schemas.microsoft.com/office/word/2020/wordml/sdtdatahash" xmlns:w16se="http://schemas.microsoft.com/office/word/2015/wordml/symex" xmlns:wpg="http://schemas.microsoft.com/office/word/2010/wordprocessingGroup" xmlns:wpi="http://schemas.microsoft.com/office/word/2010/wordprocessingInk" xmlns:wne="http://schemas.microsoft.com/office/word/2006/wordml" xmlns:wps="http://schemas.microsoft.com/office/word/2010/wordprocessingShape" mc:Ignorable="w14 w15 w16se w16cid w16 w16cex w16sdtdh wp14">
+<w:endnotes xmlns:wpc="http://schemas.microsoft.com/office/word/2010/wordprocessingCanvas" xmlns:cx="http://schemas.microsoft.com/office/drawing/2014/chartex" xmlns:cx1="http://schemas.microsoft.com/office/drawing/2015/9/8/chartex" xmlns:cx2="http://schemas.microsoft.com/office/drawing/2015/10/21/chartex" xmlns:cx3="http://schemas.microsoft.com/office/drawing/2016/5/9/chartex" xmlns:cx4="http://schemas.microsoft.com/office/drawing/2016/5/10/chartex" xmlns:cx5="http://schemas.microsoft.com/office/drawing/2016/5/11/chartex" xmlns:cx6="http://schemas.microsoft.com/office/drawing/2016/5/12/chartex" xmlns:cx7="http://schemas.microsoft.com/office/drawing/2016/5/13/chartex" xmlns:cx8="http://schemas.microsoft.com/office/drawing/2016/5/14/chartex" xmlns:mc="http://schemas.openxmlformats.org/markup-compatibility/2006" xmlns:aink="http://schemas.microsoft.com/office/drawing/2016/ink" xmlns:am3d="http://schemas.microsoft.com/office/drawing/2017/model3d" xmlns:o="urn:schemas-microsoft-com:office:office" xmlns:oel="http://schemas.microsoft.com/office/2019/extlst" xmlns:r="http://schemas.openxmlformats.org/officeDocument/2006/relationships" xmlns:m="http://schemas.openxmlformats.org/officeDocument/2006/math" xmlns:v="urn:schemas-microsoft-com:vml" xmlns:wp14="http://schemas.microsoft.com/office/word/2010/wordprocessingDrawing" xmlns:wp="http://schemas.openxmlformats.org/drawingml/2006/wordprocessingDrawing" xmlns:w10="urn:schemas-microsoft-com:office:word" xmlns:w="http://schemas.openxmlformats.org/wordprocessingml/2006/main" xmlns:w14="http://schemas.microsoft.com/office/word/2010/wordml" xmlns:w15="http://schemas.microsoft.com/office/word/2012/wordml" xmlns:w16cex="http://schemas.microsoft.com/office/word/2018/wordml/cex" xmlns:w16cid="http://schemas.microsoft.com/office/word/2016/wordml/cid" xmlns:w16="http://schemas.microsoft.com/office/word/2018/wordml" xmlns:w16sdtdh="http://schemas.microsoft.com/office/word/2020/wordml/sdtdatahash" xmlns:w16se="http://schemas.microsoft.com/office/word/2015/wordml/symex" xmlns:wpg="http://schemas.microsoft.com/office/word/2010/wordprocessingGroup" xmlns:wpi="http://schemas.microsoft.com/office/word/2010/wordprocessingInk" xmlns:wne="http://schemas.microsoft.com/office/word/2006/wordml" xmlns:wps="http://schemas.microsoft.com/office/word/2010/wordprocessingShape" mc:Ignorable="w14 w15 w16se w16cid w16 w16cex w16sdtdh wp14">
   <w:endnote w:type="separator" w:id="-1">
     <w:p>
       <w:r>
@@ -9620,7 +10239,7 @@
 </file>
 
 <file path=word/footer1.xml><?xml version="1.0" encoding="utf-8"?>
-<w:ftr xmlns:wpc="http://schemas.microsoft.com/office/word/2010/wordprocessingCanvas" xmlns:cx="http://schemas.microsoft.com/office/drawing/2014/chartex" xmlns:cx1="http://schemas.microsoft.com/office/drawing/2015/9/8/chartex" xmlns:cx2="http://schemas.microsoft.com/office/drawing/2015/10/21/chartex" xmlns:cx3="http://schemas.microsoft.com/office/drawing/2016/5/9/chartex" xmlns:cx4="http://schemas.microsoft.com/office/drawing/2016/5/10/chartex" xmlns:cx5="http://schemas.microsoft.com/office/drawing/2016/5/11/chartex" xmlns:cx6="http://schemas.microsoft.com/office/drawing/2016/5/12/chartex" xmlns:cx7="http://schemas.microsoft.com/office/drawing/2016/5/13/chartex" xmlns:cx8="http://schemas.microsoft.com/office/drawing/2016/5/14/chartex" xmlns:mc="http://schemas.openxmlformats.org/markup-compatibility/2006" xmlns:aink="http://schemas.microsoft.com/office/drawing/2016/ink" xmlns:am3d="http://schemas.microsoft.com/office/drawing/2017/model3d" xmlns:o="urn:schemas-microsoft-com:office:office" xmlns:r="http://schemas.openxmlformats.org/officeDocument/2006/relationships" xmlns:m="http://schemas.openxmlformats.org/officeDocument/2006/math" xmlns:v="urn:schemas-microsoft-com:vml" xmlns:wp14="http://schemas.microsoft.com/office/word/2010/wordprocessingDrawing" xmlns:wp="http://schemas.openxmlformats.org/drawingml/2006/wordprocessingDrawing" xmlns:w10="urn:schemas-microsoft-com:office:word" xmlns:w="http://schemas.openxmlformats.org/wordprocessingml/2006/main" xmlns:w14="http://schemas.microsoft.com/office/word/2010/wordml" xmlns:w15="http://schemas.microsoft.com/office/word/2012/wordml" xmlns:w16cex="http://schemas.microsoft.com/office/word/2018/wordml/cex" xmlns:w16cid="http://schemas.microsoft.com/office/word/2016/wordml/cid" xmlns:w16="http://schemas.microsoft.com/office/word/2018/wordml" xmlns:w16sdtdh="http://schemas.microsoft.com/office/word/2020/wordml/sdtdatahash" xmlns:w16se="http://schemas.microsoft.com/office/word/2015/wordml/symex" xmlns:wpg="http://schemas.microsoft.com/office/word/2010/wordprocessingGroup" xmlns:wpi="http://schemas.microsoft.com/office/word/2010/wordprocessingInk" xmlns:wne="http://schemas.microsoft.com/office/word/2006/wordml" xmlns:wps="http://schemas.microsoft.com/office/word/2010/wordprocessingShape" mc:Ignorable="w14 w15 w16se w16cid w16 w16cex w16sdtdh wp14">
+<w:ftr xmlns:wpc="http://schemas.microsoft.com/office/word/2010/wordprocessingCanvas" xmlns:cx="http://schemas.microsoft.com/office/drawing/2014/chartex" xmlns:cx1="http://schemas.microsoft.com/office/drawing/2015/9/8/chartex" xmlns:cx2="http://schemas.microsoft.com/office/drawing/2015/10/21/chartex" xmlns:cx3="http://schemas.microsoft.com/office/drawing/2016/5/9/chartex" xmlns:cx4="http://schemas.microsoft.com/office/drawing/2016/5/10/chartex" xmlns:cx5="http://schemas.microsoft.com/office/drawing/2016/5/11/chartex" xmlns:cx6="http://schemas.microsoft.com/office/drawing/2016/5/12/chartex" xmlns:cx7="http://schemas.microsoft.com/office/drawing/2016/5/13/chartex" xmlns:cx8="http://schemas.microsoft.com/office/drawing/2016/5/14/chartex" xmlns:mc="http://schemas.openxmlformats.org/markup-compatibility/2006" xmlns:aink="http://schemas.microsoft.com/office/drawing/2016/ink" xmlns:am3d="http://schemas.microsoft.com/office/drawing/2017/model3d" xmlns:o="urn:schemas-microsoft-com:office:office" xmlns:oel="http://schemas.microsoft.com/office/2019/extlst" xmlns:r="http://schemas.openxmlformats.org/officeDocument/2006/relationships" xmlns:m="http://schemas.openxmlformats.org/officeDocument/2006/math" xmlns:v="urn:schemas-microsoft-com:vml" xmlns:wp14="http://schemas.microsoft.com/office/word/2010/wordprocessingDrawing" xmlns:wp="http://schemas.openxmlformats.org/drawingml/2006/wordprocessingDrawing" xmlns:w10="urn:schemas-microsoft-com:office:word" xmlns:w="http://schemas.openxmlformats.org/wordprocessingml/2006/main" xmlns:w14="http://schemas.microsoft.com/office/word/2010/wordml" xmlns:w15="http://schemas.microsoft.com/office/word/2012/wordml" xmlns:w16cex="http://schemas.microsoft.com/office/word/2018/wordml/cex" xmlns:w16cid="http://schemas.microsoft.com/office/word/2016/wordml/cid" xmlns:w16="http://schemas.microsoft.com/office/word/2018/wordml" xmlns:w16sdtdh="http://schemas.microsoft.com/office/word/2020/wordml/sdtdatahash" xmlns:w16se="http://schemas.microsoft.com/office/word/2015/wordml/symex" xmlns:wpg="http://schemas.microsoft.com/office/word/2010/wordprocessingGroup" xmlns:wpi="http://schemas.microsoft.com/office/word/2010/wordprocessingInk" xmlns:wne="http://schemas.microsoft.com/office/word/2006/wordml" xmlns:wps="http://schemas.microsoft.com/office/word/2010/wordprocessingShape" mc:Ignorable="w14 w15 w16se w16cid w16 w16cex w16sdtdh wp14">
   <w:p>
     <w:pPr>
       <w:pStyle w:val="Footer"/>
@@ -9641,7 +10260,7 @@
 </file>
 
 <file path=word/footnotes.xml><?xml version="1.0" encoding="utf-8"?>
-<w:footnotes xmlns:wpc="http://schemas.microsoft.com/office/word/2010/wordprocessingCanvas" xmlns:cx="http://schemas.microsoft.com/office/drawing/2014/chartex" xmlns:cx1="http://schemas.microsoft.com/office/drawing/2015/9/8/chartex" xmlns:cx2="http://schemas.microsoft.com/office/drawing/2015/10/21/chartex" xmlns:cx3="http://schemas.microsoft.com/office/drawing/2016/5/9/chartex" xmlns:cx4="http://schemas.microsoft.com/office/drawing/2016/5/10/chartex" xmlns:cx5="http://schemas.microsoft.com/office/drawing/2016/5/11/chartex" xmlns:cx6="http://schemas.microsoft.com/office/drawing/2016/5/12/chartex" xmlns:cx7="http://schemas.microsoft.com/office/drawing/2016/5/13/chartex" xmlns:cx8="http://schemas.microsoft.com/office/drawing/2016/5/14/chartex" xmlns:mc="http://schemas.openxmlformats.org/markup-compatibility/2006" xmlns:aink="http://schemas.microsoft.com/office/drawing/2016/ink" xmlns:am3d="http://schemas.microsoft.com/office/drawing/2017/model3d" xmlns:o="urn:schemas-microsoft-com:office:office" xmlns:r="http://schemas.openxmlformats.org/officeDocument/2006/relationships" xmlns:m="http://schemas.openxmlformats.org/officeDocument/2006/math" xmlns:v="urn:schemas-microsoft-com:vml" xmlns:wp14="http://schemas.microsoft.com/office/word/2010/wordprocessingDrawing" xmlns:wp="http://schemas.openxmlformats.org/drawingml/2006/wordprocessingDrawing" xmlns:w10="urn:schemas-microsoft-com:office:word" xmlns:w="http://schemas.openxmlformats.org/wordprocessingml/2006/main" xmlns:w14="http://schemas.microsoft.com/office/word/2010/wordml" xmlns:w15="http://schemas.microsoft.com/office/word/2012/wordml" xmlns:w16cex="http://schemas.microsoft.com/office/word/2018/wordml/cex" xmlns:w16cid="http://schemas.microsoft.com/office/word/2016/wordml/cid" xmlns:w16="http://schemas.microsoft.com/office/word/2018/wordml" xmlns:w16sdtdh="http://schemas.microsoft.com/office/word/2020/wordml/sdtdatahash" xmlns:w16se="http://schemas.microsoft.com/office/word/2015/wordml/symex" xmlns:wpg="http://schemas.microsoft.com/office/word/2010/wordprocessingGroup" xmlns:wpi="http://schemas.microsoft.com/office/word/2010/wordprocessingInk" xmlns:wne="http://schemas.microsoft.com/office/word/2006/wordml" xmlns:wps="http://schemas.microsoft.com/office/word/2010/wordprocessingShape" mc:Ignorable="w14 w15 w16se w16cid w16 w16cex w16sdtdh wp14">
+<w:footnotes xmlns:wpc="http://schemas.microsoft.com/office/word/2010/wordprocessingCanvas" xmlns:cx="http://schemas.microsoft.com/office/drawing/2014/chartex" xmlns:cx1="http://schemas.microsoft.com/office/drawing/2015/9/8/chartex" xmlns:cx2="http://schemas.microsoft.com/office/drawing/2015/10/21/chartex" xmlns:cx3="http://schemas.microsoft.com/office/drawing/2016/5/9/chartex" xmlns:cx4="http://schemas.microsoft.com/office/drawing/2016/5/10/chartex" xmlns:cx5="http://schemas.microsoft.com/office/drawing/2016/5/11/chartex" xmlns:cx6="http://schemas.microsoft.com/office/drawing/2016/5/12/chartex" xmlns:cx7="http://schemas.microsoft.com/office/drawing/2016/5/13/chartex" xmlns:cx8="http://schemas.microsoft.com/office/drawing/2016/5/14/chartex" xmlns:mc="http://schemas.openxmlformats.org/markup-compatibility/2006" xmlns:aink="http://schemas.microsoft.com/office/drawing/2016/ink" xmlns:am3d="http://schemas.microsoft.com/office/drawing/2017/model3d" xmlns:o="urn:schemas-microsoft-com:office:office" xmlns:oel="http://schemas.microsoft.com/office/2019/extlst" xmlns:r="http://schemas.openxmlformats.org/officeDocument/2006/relationships" xmlns:m="http://schemas.openxmlformats.org/officeDocument/2006/math" xmlns:v="urn:schemas-microsoft-com:vml" xmlns:wp14="http://schemas.microsoft.com/office/word/2010/wordprocessingDrawing" xmlns:wp="http://schemas.openxmlformats.org/drawingml/2006/wordprocessingDrawing" xmlns:w10="urn:schemas-microsoft-com:office:word" xmlns:w="http://schemas.openxmlformats.org/wordprocessingml/2006/main" xmlns:w14="http://schemas.microsoft.com/office/word/2010/wordml" xmlns:w15="http://schemas.microsoft.com/office/word/2012/wordml" xmlns:w16cex="http://schemas.microsoft.com/office/word/2018/wordml/cex" xmlns:w16cid="http://schemas.microsoft.com/office/word/2016/wordml/cid" xmlns:w16="http://schemas.microsoft.com/office/word/2018/wordml" xmlns:w16sdtdh="http://schemas.microsoft.com/office/word/2020/wordml/sdtdatahash" xmlns:w16se="http://schemas.microsoft.com/office/word/2015/wordml/symex" xmlns:wpg="http://schemas.microsoft.com/office/word/2010/wordprocessingGroup" xmlns:wpi="http://schemas.microsoft.com/office/word/2010/wordprocessingInk" xmlns:wne="http://schemas.microsoft.com/office/word/2006/wordml" xmlns:wps="http://schemas.microsoft.com/office/word/2010/wordprocessingShape" mc:Ignorable="w14 w15 w16se w16cid w16 w16cex w16sdtdh wp14">
   <w:footnote w:type="separator" w:id="-1">
     <w:p>
       <w:r>
@@ -9660,7 +10279,7 @@
 </file>
 
 <file path=word/header1.xml><?xml version="1.0" encoding="utf-8"?>
-<w:hdr xmlns:wpc="http://schemas.microsoft.com/office/word/2010/wordprocessingCanvas" xmlns:cx="http://schemas.microsoft.com/office/drawing/2014/chartex" xmlns:cx1="http://schemas.microsoft.com/office/drawing/2015/9/8/chartex" xmlns:cx2="http://schemas.microsoft.com/office/drawing/2015/10/21/chartex" xmlns:cx3="http://schemas.microsoft.com/office/drawing/2016/5/9/chartex" xmlns:cx4="http://schemas.microsoft.com/office/drawing/2016/5/10/chartex" xmlns:cx5="http://schemas.microsoft.com/office/drawing/2016/5/11/chartex" xmlns:cx6="http://schemas.microsoft.com/office/drawing/2016/5/12/chartex" xmlns:cx7="http://schemas.microsoft.com/office/drawing/2016/5/13/chartex" xmlns:cx8="http://schemas.microsoft.com/office/drawing/2016/5/14/chartex" xmlns:mc="http://schemas.openxmlformats.org/markup-compatibility/2006" xmlns:aink="http://schemas.microsoft.com/office/drawing/2016/ink" xmlns:am3d="http://schemas.microsoft.com/office/drawing/2017/model3d" xmlns:o="urn:schemas-microsoft-com:office:office" xmlns:r="http://schemas.openxmlformats.org/officeDocument/2006/relationships" xmlns:m="http://schemas.openxmlformats.org/officeDocument/2006/math" xmlns:v="urn:schemas-microsoft-com:vml" xmlns:wp14="http://schemas.microsoft.com/office/word/2010/wordprocessingDrawing" xmlns:wp="http://schemas.openxmlformats.org/drawingml/2006/wordprocessingDrawing" xmlns:w10="urn:schemas-microsoft-com:office:word" xmlns:w="http://schemas.openxmlformats.org/wordprocessingml/2006/main" xmlns:w14="http://schemas.microsoft.com/office/word/2010/wordml" xmlns:w15="http://schemas.microsoft.com/office/word/2012/wordml" xmlns:w16cex="http://schemas.microsoft.com/office/word/2018/wordml/cex" xmlns:w16cid="http://schemas.microsoft.com/office/word/2016/wordml/cid" xmlns:w16="http://schemas.microsoft.com/office/word/2018/wordml" xmlns:w16sdtdh="http://schemas.microsoft.com/office/word/2020/wordml/sdtdatahash" xmlns:w16se="http://schemas.microsoft.com/office/word/2015/wordml/symex" xmlns:wpg="http://schemas.microsoft.com/office/word/2010/wordprocessingGroup" xmlns:wpi="http://schemas.microsoft.com/office/word/2010/wordprocessingInk" xmlns:wne="http://schemas.microsoft.com/office/word/2006/wordml" xmlns:wps="http://schemas.microsoft.com/office/word/2010/wordprocessingShape" mc:Ignorable="w14 w15 w16se w16cid w16 w16cex w16sdtdh wp14">
+<w:hdr xmlns:wpc="http://schemas.microsoft.com/office/word/2010/wordprocessingCanvas" xmlns:cx="http://schemas.microsoft.com/office/drawing/2014/chartex" xmlns:cx1="http://schemas.microsoft.com/office/drawing/2015/9/8/chartex" xmlns:cx2="http://schemas.microsoft.com/office/drawing/2015/10/21/chartex" xmlns:cx3="http://schemas.microsoft.com/office/drawing/2016/5/9/chartex" xmlns:cx4="http://schemas.microsoft.com/office/drawing/2016/5/10/chartex" xmlns:cx5="http://schemas.microsoft.com/office/drawing/2016/5/11/chartex" xmlns:cx6="http://schemas.microsoft.com/office/drawing/2016/5/12/chartex" xmlns:cx7="http://schemas.microsoft.com/office/drawing/2016/5/13/chartex" xmlns:cx8="http://schemas.microsoft.com/office/drawing/2016/5/14/chartex" xmlns:mc="http://schemas.openxmlformats.org/markup-compatibility/2006" xmlns:aink="http://schemas.microsoft.com/office/drawing/2016/ink" xmlns:am3d="http://schemas.microsoft.com/office/drawing/2017/model3d" xmlns:o="urn:schemas-microsoft-com:office:office" xmlns:oel="http://schemas.microsoft.com/office/2019/extlst" xmlns:r="http://schemas.openxmlformats.org/officeDocument/2006/relationships" xmlns:m="http://schemas.openxmlformats.org/officeDocument/2006/math" xmlns:v="urn:schemas-microsoft-com:vml" xmlns:wp14="http://schemas.microsoft.com/office/word/2010/wordprocessingDrawing" xmlns:wp="http://schemas.openxmlformats.org/drawingml/2006/wordprocessingDrawing" xmlns:w10="urn:schemas-microsoft-com:office:word" xmlns:w="http://schemas.openxmlformats.org/wordprocessingml/2006/main" xmlns:w14="http://schemas.microsoft.com/office/word/2010/wordml" xmlns:w15="http://schemas.microsoft.com/office/word/2012/wordml" xmlns:w16cex="http://schemas.microsoft.com/office/word/2018/wordml/cex" xmlns:w16cid="http://schemas.microsoft.com/office/word/2016/wordml/cid" xmlns:w16="http://schemas.microsoft.com/office/word/2018/wordml" xmlns:w16sdtdh="http://schemas.microsoft.com/office/word/2020/wordml/sdtdatahash" xmlns:w16se="http://schemas.microsoft.com/office/word/2015/wordml/symex" xmlns:wpg="http://schemas.microsoft.com/office/word/2010/wordprocessingGroup" xmlns:wpi="http://schemas.microsoft.com/office/word/2010/wordprocessingInk" xmlns:wne="http://schemas.microsoft.com/office/word/2006/wordml" xmlns:wps="http://schemas.microsoft.com/office/word/2010/wordprocessingShape" mc:Ignorable="w14 w15 w16se w16cid w16 w16cex w16sdtdh wp14">
   <w:tbl>
     <w:tblPr>
       <w:tblStyle w:val="TableGridLight"/>
@@ -9903,7 +10522,7 @@
 </file>
 
 <file path=word/numbering.xml><?xml version="1.0" encoding="utf-8"?>
-<w:numbering xmlns:wpc="http://schemas.microsoft.com/office/word/2010/wordprocessingCanvas" xmlns:cx="http://schemas.microsoft.com/office/drawing/2014/chartex" xmlns:cx1="http://schemas.microsoft.com/office/drawing/2015/9/8/chartex" xmlns:cx2="http://schemas.microsoft.com/office/drawing/2015/10/21/chartex" xmlns:cx3="http://schemas.microsoft.com/office/drawing/2016/5/9/chartex" xmlns:cx4="http://schemas.microsoft.com/office/drawing/2016/5/10/chartex" xmlns:cx5="http://schemas.microsoft.com/office/drawing/2016/5/11/chartex" xmlns:cx6="http://schemas.microsoft.com/office/drawing/2016/5/12/chartex" xmlns:cx7="http://schemas.microsoft.com/office/drawing/2016/5/13/chartex" xmlns:cx8="http://schemas.microsoft.com/office/drawing/2016/5/14/chartex" xmlns:mc="http://schemas.openxmlformats.org/markup-compatibility/2006" xmlns:aink="http://schemas.microsoft.com/office/drawing/2016/ink" xmlns:am3d="http://schemas.microsoft.com/office/drawing/2017/model3d" xmlns:o="urn:schemas-microsoft-com:office:office" xmlns:r="http://schemas.openxmlformats.org/officeDocument/2006/relationships" xmlns:m="http://schemas.openxmlformats.org/officeDocument/2006/math" xmlns:v="urn:schemas-microsoft-com:vml" xmlns:wp14="http://schemas.microsoft.com/office/word/2010/wordprocessingDrawing" xmlns:wp="http://schemas.openxmlformats.org/drawingml/2006/wordprocessingDrawing" xmlns:w10="urn:schemas-microsoft-com:office:word" xmlns:w="http://schemas.openxmlformats.org/wordprocessingml/2006/main" xmlns:w14="http://schemas.microsoft.com/office/word/2010/wordml" xmlns:w15="http://schemas.microsoft.com/office/word/2012/wordml" xmlns:w16cex="http://schemas.microsoft.com/office/word/2018/wordml/cex" xmlns:w16cid="http://schemas.microsoft.com/office/word/2016/wordml/cid" xmlns:w16="http://schemas.microsoft.com/office/word/2018/wordml" xmlns:w16sdtdh="http://schemas.microsoft.com/office/word/2020/wordml/sdtdatahash" xmlns:w16se="http://schemas.microsoft.com/office/word/2015/wordml/symex" xmlns:wpg="http://schemas.microsoft.com/office/word/2010/wordprocessingGroup" xmlns:wpi="http://schemas.microsoft.com/office/word/2010/wordprocessingInk" xmlns:wne="http://schemas.microsoft.com/office/word/2006/wordml" xmlns:wps="http://schemas.microsoft.com/office/word/2010/wordprocessingShape" mc:Ignorable="w14 w15 w16se w16cid w16 w16cex w16sdtdh wp14">
+<w:numbering xmlns:wpc="http://schemas.microsoft.com/office/word/2010/wordprocessingCanvas" xmlns:cx="http://schemas.microsoft.com/office/drawing/2014/chartex" xmlns:cx1="http://schemas.microsoft.com/office/drawing/2015/9/8/chartex" xmlns:cx2="http://schemas.microsoft.com/office/drawing/2015/10/21/chartex" xmlns:cx3="http://schemas.microsoft.com/office/drawing/2016/5/9/chartex" xmlns:cx4="http://schemas.microsoft.com/office/drawing/2016/5/10/chartex" xmlns:cx5="http://schemas.microsoft.com/office/drawing/2016/5/11/chartex" xmlns:cx6="http://schemas.microsoft.com/office/drawing/2016/5/12/chartex" xmlns:cx7="http://schemas.microsoft.com/office/drawing/2016/5/13/chartex" xmlns:cx8="http://schemas.microsoft.com/office/drawing/2016/5/14/chartex" xmlns:mc="http://schemas.openxmlformats.org/markup-compatibility/2006" xmlns:aink="http://schemas.microsoft.com/office/drawing/2016/ink" xmlns:am3d="http://schemas.microsoft.com/office/drawing/2017/model3d" xmlns:o="urn:schemas-microsoft-com:office:office" xmlns:oel="http://schemas.microsoft.com/office/2019/extlst" xmlns:r="http://schemas.openxmlformats.org/officeDocument/2006/relationships" xmlns:m="http://schemas.openxmlformats.org/officeDocument/2006/math" xmlns:v="urn:schemas-microsoft-com:vml" xmlns:wp14="http://schemas.microsoft.com/office/word/2010/wordprocessingDrawing" xmlns:wp="http://schemas.openxmlformats.org/drawingml/2006/wordprocessingDrawing" xmlns:w10="urn:schemas-microsoft-com:office:word" xmlns:w="http://schemas.openxmlformats.org/wordprocessingml/2006/main" xmlns:w14="http://schemas.microsoft.com/office/word/2010/wordml" xmlns:w15="http://schemas.microsoft.com/office/word/2012/wordml" xmlns:w16cex="http://schemas.microsoft.com/office/word/2018/wordml/cex" xmlns:w16cid="http://schemas.microsoft.com/office/word/2016/wordml/cid" xmlns:w16="http://schemas.microsoft.com/office/word/2018/wordml" xmlns:w16sdtdh="http://schemas.microsoft.com/office/word/2020/wordml/sdtdatahash" xmlns:w16se="http://schemas.microsoft.com/office/word/2015/wordml/symex" xmlns:wpg="http://schemas.microsoft.com/office/word/2010/wordprocessingGroup" xmlns:wpi="http://schemas.microsoft.com/office/word/2010/wordprocessingInk" xmlns:wne="http://schemas.microsoft.com/office/word/2006/wordml" xmlns:wps="http://schemas.microsoft.com/office/word/2010/wordprocessingShape" mc:Ignorable="w14 w15 w16se w16cid w16 w16cex w16sdtdh wp14">
   <w:abstractNum w:abstractNumId="0" w15:restartNumberingAfterBreak="0">
     <w:nsid w:val="FFFFFF1D"/>
     <w:multiLevelType w:val="multilevel"/>
@@ -10380,16 +10999,16 @@
       </w:rPr>
     </w:lvl>
   </w:abstractNum>
-  <w:num w:numId="1">
+  <w:num w:numId="1" w16cid:durableId="1724253718">
     <w:abstractNumId w:val="2"/>
   </w:num>
-  <w:num w:numId="2">
+  <w:num w:numId="2" w16cid:durableId="1468083765">
     <w:abstractNumId w:val="1"/>
   </w:num>
-  <w:num w:numId="3">
+  <w:num w:numId="3" w16cid:durableId="1736858641">
     <w:abstractNumId w:val="3"/>
   </w:num>
-  <w:num w:numId="4">
+  <w:num w:numId="4" w16cid:durableId="1991597656">
     <w:abstractNumId w:val="0"/>
   </w:num>
   <w:numIdMacAtCleanup w:val="3"/>
@@ -11747,7 +12366,12 @@
 </file>
 
 <file path=customXml/item1.xml><?xml version="1.0" encoding="utf-8"?>
-<b:Sources xmlns:b="http://schemas.openxmlformats.org/officeDocument/2006/bibliography" xmlns="http://schemas.openxmlformats.org/officeDocument/2006/bibliography" SelectedStyle="\APA.XSL" StyleName="APA"/>
+<?mso-contentType ?>
+<FormTemplates xmlns="http://schemas.microsoft.com/sharepoint/v3/contenttype/forms">
+  <Display>DocumentLibraryForm</Display>
+  <Edit>DocumentLibraryForm</Edit>
+  <New>DocumentLibraryForm</New>
+</FormTemplates>
 </file>
 
 <file path=customXml/item2.xml><?xml version="1.0" encoding="utf-8"?>
@@ -11916,18 +12540,13 @@
 </file>
 
 <file path=customXml/item3.xml><?xml version="1.0" encoding="utf-8"?>
-<?mso-contentType ?>
-<FormTemplates xmlns="http://schemas.microsoft.com/sharepoint/v3/contenttype/forms">
-  <Display>DocumentLibraryForm</Display>
-  <Edit>DocumentLibraryForm</Edit>
-  <New>DocumentLibraryForm</New>
-</FormTemplates>
+<b:Sources xmlns:b="http://schemas.openxmlformats.org/officeDocument/2006/bibliography" xmlns="http://schemas.openxmlformats.org/officeDocument/2006/bibliography" SelectedStyle="\APA.XSL" StyleName="APA"/>
 </file>
 
 <file path=customXml/itemProps1.xml><?xml version="1.0" encoding="utf-8"?>
-<ds:datastoreItem xmlns:ds="http://schemas.openxmlformats.org/officeDocument/2006/customXml" ds:itemID="{C049B9B0-E259-43F0-8CA8-9688C0282243}">
+<ds:datastoreItem xmlns:ds="http://schemas.openxmlformats.org/officeDocument/2006/customXml" ds:itemID="{CB114600-4DAC-4247-A033-FF6ABD5BC677}">
   <ds:schemaRefs>
-    <ds:schemaRef ds:uri="http://schemas.openxmlformats.org/officeDocument/2006/bibliography"/>
+    <ds:schemaRef ds:uri="http://schemas.microsoft.com/sharepoint/v3/contenttype/forms"/>
   </ds:schemaRefs>
 </ds:datastoreItem>
 </file>
@@ -11952,9 +12571,9 @@
 </file>
 
 <file path=customXml/itemProps3.xml><?xml version="1.0" encoding="utf-8"?>
-<ds:datastoreItem xmlns:ds="http://schemas.openxmlformats.org/officeDocument/2006/customXml" ds:itemID="{CB114600-4DAC-4247-A033-FF6ABD5BC677}">
+<ds:datastoreItem xmlns:ds="http://schemas.openxmlformats.org/officeDocument/2006/customXml" ds:itemID="{C049B9B0-E259-43F0-8CA8-9688C0282243}">
   <ds:schemaRefs>
-    <ds:schemaRef ds:uri="http://schemas.microsoft.com/sharepoint/v3/contenttype/forms"/>
+    <ds:schemaRef ds:uri="http://schemas.openxmlformats.org/officeDocument/2006/bibliography"/>
   </ds:schemaRefs>
 </ds:datastoreItem>
 </file>
</xml_diff>